<commit_message>
Adicionando P2 do Alciano
</commit_message>
<xml_diff>
--- a/Eng Software_Alciano/TRABALHO ALCIANO P2.docx
+++ b/Eng Software_Alciano/TRABALHO ALCIANO P2.docx
@@ -4,988 +4,1220 @@
   <w:body>
     <w:p>
       <w:pPr>
-        <w:pStyle w:val="Ttulo3"/>
-        <w:spacing w:before="78"/>
-        <w:ind w:left="565" w:right="6" w:firstLine="0"/>
         <w:jc w:val="center"/>
-      </w:pPr>
-      <w:bookmarkStart w:id="0" w:name="6tsr4crlemf4" w:colFirst="0" w:colLast="0"/>
-      <w:bookmarkStart w:id="1" w:name="y81ahk2gk0kx" w:colFirst="0" w:colLast="0"/>
-      <w:bookmarkStart w:id="2" w:name="svv2fujte9o8" w:colFirst="0" w:colLast="0"/>
-      <w:bookmarkStart w:id="3" w:name="iui3xsp1ssb8" w:colFirst="0" w:colLast="0"/>
+        <w:rPr>
+          <w:rFonts w:ascii="Arial" w:hAnsi="Arial" w:cs="Arial"/>
+        </w:rPr>
+      </w:pPr>
+      <w:r>
+        <w:rPr>
+          <w:rFonts w:ascii="Arial" w:hAnsi="Arial" w:cs="Arial"/>
+          <w:b/>
+          <w:bCs/>
+          <w:caps/>
+          <w:sz w:val="32"/>
+          <w:szCs w:val="32"/>
+        </w:rPr>
+        <w:t>C</w:t>
+      </w:r>
+      <w:r>
+        <w:rPr>
+          <w:rFonts w:ascii="Arial" w:hAnsi="Arial" w:cs="Arial"/>
+          <w:b/>
+          <w:bCs/>
+          <w:caps/>
+        </w:rPr>
+        <w:t xml:space="preserve">ENTRO   </w:t>
+      </w:r>
+      <w:r>
+        <w:rPr>
+          <w:rFonts w:ascii="Arial" w:hAnsi="Arial" w:cs="Arial"/>
+          <w:b/>
+          <w:bCs/>
+          <w:caps/>
+          <w:sz w:val="32"/>
+          <w:szCs w:val="32"/>
+        </w:rPr>
+        <w:t>E</w:t>
+      </w:r>
+      <w:r>
+        <w:rPr>
+          <w:rFonts w:ascii="Arial" w:hAnsi="Arial" w:cs="Arial"/>
+          <w:b/>
+          <w:bCs/>
+          <w:caps/>
+        </w:rPr>
+        <w:t xml:space="preserve">STADUAL   DE   </w:t>
+      </w:r>
+      <w:r>
+        <w:rPr>
+          <w:rFonts w:ascii="Arial" w:hAnsi="Arial" w:cs="Arial"/>
+          <w:b/>
+          <w:bCs/>
+          <w:caps/>
+          <w:sz w:val="32"/>
+          <w:szCs w:val="32"/>
+        </w:rPr>
+        <w:t>E</w:t>
+      </w:r>
+      <w:r>
+        <w:rPr>
+          <w:rFonts w:ascii="Arial" w:hAnsi="Arial" w:cs="Arial"/>
+          <w:b/>
+          <w:bCs/>
+          <w:caps/>
+        </w:rPr>
+        <w:t xml:space="preserve">DUCAÇÃO   </w:t>
+      </w:r>
+      <w:r>
+        <w:rPr>
+          <w:rFonts w:ascii="Arial" w:hAnsi="Arial" w:cs="Arial"/>
+          <w:b/>
+          <w:bCs/>
+          <w:caps/>
+          <w:sz w:val="32"/>
+          <w:szCs w:val="32"/>
+        </w:rPr>
+        <w:t>T</w:t>
+      </w:r>
+      <w:r>
+        <w:rPr>
+          <w:rFonts w:ascii="Arial" w:hAnsi="Arial" w:cs="Arial"/>
+          <w:b/>
+          <w:bCs/>
+          <w:caps/>
+        </w:rPr>
+        <w:t xml:space="preserve">ECNOLÓGICA   </w:t>
+      </w:r>
+      <w:r>
+        <w:rPr>
+          <w:rFonts w:ascii="Arial" w:hAnsi="Arial" w:cs="Arial"/>
+          <w:b/>
+          <w:bCs/>
+          <w:caps/>
+          <w:sz w:val="32"/>
+          <w:szCs w:val="32"/>
+        </w:rPr>
+        <w:t>P</w:t>
+      </w:r>
+      <w:r>
+        <w:rPr>
+          <w:rFonts w:ascii="Arial" w:hAnsi="Arial" w:cs="Arial"/>
+          <w:b/>
+          <w:bCs/>
+          <w:caps/>
+        </w:rPr>
+        <w:t xml:space="preserve">AULA   </w:t>
+      </w:r>
+      <w:r>
+        <w:rPr>
+          <w:rFonts w:ascii="Arial" w:hAnsi="Arial" w:cs="Arial"/>
+          <w:b/>
+          <w:bCs/>
+          <w:caps/>
+          <w:sz w:val="32"/>
+          <w:szCs w:val="32"/>
+        </w:rPr>
+        <w:t>S</w:t>
+      </w:r>
+      <w:r>
+        <w:rPr>
+          <w:rFonts w:ascii="Arial" w:hAnsi="Arial" w:cs="Arial"/>
+          <w:b/>
+          <w:bCs/>
+          <w:caps/>
+        </w:rPr>
+        <w:t>OUZA</w:t>
+      </w:r>
+    </w:p>
+    <w:p>
+      <w:pPr>
+        <w:jc w:val="center"/>
+        <w:rPr>
+          <w:rFonts w:ascii="Arial" w:hAnsi="Arial" w:cs="Arial"/>
+        </w:rPr>
+      </w:pPr>
+      <w:r>
+        <w:rPr>
+          <w:rFonts w:ascii="Arial" w:hAnsi="Arial" w:cs="Arial"/>
+          <w:b/>
+          <w:bCs/>
+          <w:caps/>
+        </w:rPr>
+        <w:t>F</w:t>
+      </w:r>
+      <w:r>
+        <w:rPr>
+          <w:rFonts w:ascii="Arial" w:hAnsi="Arial" w:cs="Arial"/>
+          <w:b/>
+          <w:bCs/>
+          <w:caps/>
+          <w:sz w:val="20"/>
+          <w:szCs w:val="20"/>
+        </w:rPr>
+        <w:t xml:space="preserve">ACULDADE DE </w:t>
+      </w:r>
+      <w:r>
+        <w:rPr>
+          <w:rFonts w:ascii="Arial" w:hAnsi="Arial" w:cs="Arial"/>
+          <w:b/>
+          <w:bCs/>
+          <w:caps/>
+        </w:rPr>
+        <w:t>T</w:t>
+      </w:r>
+      <w:r>
+        <w:rPr>
+          <w:rFonts w:ascii="Arial" w:hAnsi="Arial" w:cs="Arial"/>
+          <w:b/>
+          <w:bCs/>
+          <w:caps/>
+          <w:sz w:val="20"/>
+          <w:szCs w:val="20"/>
+        </w:rPr>
+        <w:t xml:space="preserve">ECNOLOGIA DE </w:t>
+      </w:r>
+      <w:r>
+        <w:rPr>
+          <w:rFonts w:ascii="Arial" w:hAnsi="Arial" w:cs="Arial"/>
+          <w:b/>
+          <w:bCs/>
+          <w:caps/>
+        </w:rPr>
+        <w:t>L</w:t>
+      </w:r>
+      <w:r>
+        <w:rPr>
+          <w:rFonts w:ascii="Arial" w:hAnsi="Arial" w:cs="Arial"/>
+          <w:b/>
+          <w:bCs/>
+          <w:caps/>
+          <w:sz w:val="20"/>
+          <w:szCs w:val="20"/>
+        </w:rPr>
+        <w:t xml:space="preserve">INS </w:t>
+      </w:r>
+      <w:r>
+        <w:rPr>
+          <w:rFonts w:ascii="Arial" w:hAnsi="Arial" w:cs="Arial"/>
+          <w:b/>
+          <w:bCs/>
+          <w:caps/>
+        </w:rPr>
+        <w:t>P</w:t>
+      </w:r>
+      <w:r>
+        <w:rPr>
+          <w:rFonts w:ascii="Arial" w:hAnsi="Arial" w:cs="Arial"/>
+          <w:b/>
+          <w:bCs/>
+          <w:caps/>
+          <w:sz w:val="20"/>
+          <w:szCs w:val="20"/>
+        </w:rPr>
+        <w:t xml:space="preserve">ROF. </w:t>
+      </w:r>
+      <w:r>
+        <w:rPr>
+          <w:rFonts w:ascii="Arial" w:hAnsi="Arial" w:cs="Arial"/>
+          <w:b/>
+          <w:bCs/>
+          <w:caps/>
+        </w:rPr>
+        <w:t>A</w:t>
+      </w:r>
+      <w:r>
+        <w:rPr>
+          <w:rFonts w:ascii="Arial" w:hAnsi="Arial" w:cs="Arial"/>
+          <w:b/>
+          <w:bCs/>
+          <w:caps/>
+          <w:sz w:val="20"/>
+          <w:szCs w:val="20"/>
+        </w:rPr>
+        <w:t xml:space="preserve">NTONIO </w:t>
+      </w:r>
+      <w:r>
+        <w:rPr>
+          <w:rFonts w:ascii="Arial" w:hAnsi="Arial" w:cs="Arial"/>
+          <w:b/>
+          <w:bCs/>
+          <w:caps/>
+        </w:rPr>
+        <w:t>S</w:t>
+      </w:r>
+      <w:r>
+        <w:rPr>
+          <w:rFonts w:ascii="Arial" w:hAnsi="Arial" w:cs="Arial"/>
+          <w:b/>
+          <w:bCs/>
+          <w:caps/>
+          <w:sz w:val="20"/>
+          <w:szCs w:val="20"/>
+        </w:rPr>
+        <w:t>EABRA</w:t>
+      </w:r>
+    </w:p>
+    <w:p>
+      <w:pPr>
+        <w:jc w:val="center"/>
+        <w:rPr>
+          <w:rFonts w:ascii="Arial" w:hAnsi="Arial" w:cs="Arial"/>
+        </w:rPr>
+      </w:pPr>
+      <w:r>
+        <w:rPr>
+          <w:rFonts w:ascii="Arial" w:hAnsi="Arial" w:cs="Arial"/>
+          <w:b/>
+          <w:bCs/>
+          <w:caps/>
+        </w:rPr>
+        <w:t>C</w:t>
+      </w:r>
+      <w:r>
+        <w:rPr>
+          <w:rFonts w:ascii="Arial" w:hAnsi="Arial" w:cs="Arial"/>
+          <w:b/>
+          <w:bCs/>
+          <w:caps/>
+          <w:sz w:val="20"/>
+          <w:szCs w:val="20"/>
+        </w:rPr>
+        <w:t xml:space="preserve">URSO </w:t>
+      </w:r>
+      <w:r>
+        <w:rPr>
+          <w:rFonts w:ascii="Arial" w:hAnsi="Arial" w:cs="Arial"/>
+          <w:b/>
+          <w:bCs/>
+          <w:caps/>
+        </w:rPr>
+        <w:t>S</w:t>
+      </w:r>
+      <w:r>
+        <w:rPr>
+          <w:rFonts w:ascii="Arial" w:hAnsi="Arial" w:cs="Arial"/>
+          <w:b/>
+          <w:bCs/>
+          <w:caps/>
+          <w:sz w:val="20"/>
+          <w:szCs w:val="20"/>
+        </w:rPr>
+        <w:t xml:space="preserve">UPERIOR DE </w:t>
+      </w:r>
+      <w:r>
+        <w:rPr>
+          <w:rFonts w:ascii="Arial" w:hAnsi="Arial" w:cs="Arial"/>
+          <w:b/>
+          <w:bCs/>
+          <w:caps/>
+        </w:rPr>
+        <w:t>T</w:t>
+      </w:r>
+      <w:r>
+        <w:rPr>
+          <w:rFonts w:ascii="Arial" w:hAnsi="Arial" w:cs="Arial"/>
+          <w:b/>
+          <w:bCs/>
+          <w:caps/>
+          <w:sz w:val="20"/>
+          <w:szCs w:val="20"/>
+        </w:rPr>
+        <w:t xml:space="preserve">ECNOLOGIA EM </w:t>
+      </w:r>
+      <w:r>
+        <w:rPr>
+          <w:rFonts w:ascii="Arial" w:hAnsi="Arial" w:cs="Arial"/>
+          <w:b/>
+          <w:bCs/>
+          <w:caps/>
+        </w:rPr>
+        <w:t>A</w:t>
+      </w:r>
+      <w:r>
+        <w:rPr>
+          <w:rFonts w:ascii="Arial" w:hAnsi="Arial" w:cs="Arial"/>
+          <w:b/>
+          <w:bCs/>
+          <w:caps/>
+          <w:sz w:val="20"/>
+          <w:szCs w:val="20"/>
+        </w:rPr>
+        <w:t xml:space="preserve">NÁLISE E </w:t>
+      </w:r>
+      <w:r>
+        <w:rPr>
+          <w:rFonts w:ascii="Arial" w:hAnsi="Arial" w:cs="Arial"/>
+          <w:b/>
+          <w:bCs/>
+          <w:caps/>
+        </w:rPr>
+        <w:t>D</w:t>
+      </w:r>
+      <w:r>
+        <w:rPr>
+          <w:rFonts w:ascii="Arial" w:hAnsi="Arial" w:cs="Arial"/>
+          <w:b/>
+          <w:bCs/>
+          <w:caps/>
+          <w:sz w:val="20"/>
+          <w:szCs w:val="20"/>
+        </w:rPr>
+        <w:t xml:space="preserve">ESENVOLVIMENTO DE </w:t>
+      </w:r>
+      <w:r>
+        <w:rPr>
+          <w:rFonts w:ascii="Arial" w:hAnsi="Arial" w:cs="Arial"/>
+          <w:b/>
+          <w:bCs/>
+          <w:caps/>
+        </w:rPr>
+        <w:t>S</w:t>
+      </w:r>
+      <w:r>
+        <w:rPr>
+          <w:rFonts w:ascii="Arial" w:hAnsi="Arial" w:cs="Arial"/>
+          <w:b/>
+          <w:bCs/>
+          <w:caps/>
+          <w:sz w:val="20"/>
+          <w:szCs w:val="20"/>
+        </w:rPr>
+        <w:t>ISTEMAS</w:t>
+      </w:r>
+    </w:p>
+    <w:p>
+      <w:pPr>
+        <w:pStyle w:val="Textbody"/>
+        <w:jc w:val="center"/>
+        <w:rPr>
+          <w:rFonts w:ascii="Arial" w:hAnsi="Arial" w:cs="Arial"/>
+          <w:b/>
+          <w:color w:val="000000" w:themeColor="text1"/>
+        </w:rPr>
+      </w:pPr>
+    </w:p>
+    <w:p>
+      <w:pPr>
+        <w:pStyle w:val="Textbody"/>
+        <w:jc w:val="center"/>
+        <w:rPr>
+          <w:rFonts w:ascii="Arial" w:hAnsi="Arial" w:cs="Arial"/>
+          <w:color w:val="000000" w:themeColor="text1"/>
+        </w:rPr>
+      </w:pPr>
+    </w:p>
+    <w:p>
+      <w:pPr>
+        <w:pStyle w:val="Textbody"/>
+        <w:jc w:val="center"/>
+        <w:rPr>
+          <w:rFonts w:ascii="Arial" w:hAnsi="Arial" w:cs="Arial"/>
+          <w:color w:val="000000" w:themeColor="text1"/>
+        </w:rPr>
+      </w:pPr>
+    </w:p>
+    <w:p>
+      <w:pPr>
+        <w:pStyle w:val="Textbody"/>
+        <w:jc w:val="center"/>
+        <w:rPr>
+          <w:rFonts w:ascii="Arial" w:hAnsi="Arial" w:cs="Arial"/>
+          <w:color w:val="000000" w:themeColor="text1"/>
+        </w:rPr>
+      </w:pPr>
+    </w:p>
+    <w:p>
+      <w:pPr>
+        <w:pStyle w:val="Textbody"/>
+        <w:jc w:val="center"/>
+        <w:rPr>
+          <w:rFonts w:ascii="Arial" w:hAnsi="Arial" w:cs="Arial"/>
+          <w:color w:val="000000" w:themeColor="text1"/>
+        </w:rPr>
+      </w:pPr>
+      <w:r>
+        <w:rPr>
+          <w:rFonts w:ascii="Arial" w:hAnsi="Arial" w:cs="Arial"/>
+          <w:color w:val="000000" w:themeColor="text1"/>
+        </w:rPr>
+        <w:t>Anderson Clayton Pereira de Assis</w:t>
+      </w:r>
+    </w:p>
+    <w:p>
+      <w:pPr>
+        <w:pStyle w:val="Textbody"/>
+        <w:jc w:val="center"/>
+        <w:rPr>
+          <w:rFonts w:ascii="Arial" w:hAnsi="Arial" w:cs="Arial"/>
+          <w:color w:val="000000" w:themeColor="text1"/>
+        </w:rPr>
+      </w:pPr>
+      <w:r>
+        <w:rPr>
+          <w:rFonts w:ascii="Arial" w:hAnsi="Arial" w:cs="Arial"/>
+          <w:color w:val="000000" w:themeColor="text1"/>
+        </w:rPr>
+        <w:t>Anderson Porto Abrantes</w:t>
+      </w:r>
+    </w:p>
+    <w:p>
+      <w:pPr>
+        <w:pStyle w:val="Textbody"/>
+        <w:jc w:val="center"/>
+        <w:rPr>
+          <w:rFonts w:ascii="Arial" w:hAnsi="Arial" w:cs="Arial"/>
+          <w:color w:val="000000" w:themeColor="text1"/>
+        </w:rPr>
+      </w:pPr>
+      <w:r>
+        <w:rPr>
+          <w:rFonts w:ascii="Arial" w:hAnsi="Arial" w:cs="Arial"/>
+          <w:color w:val="000000" w:themeColor="text1"/>
+        </w:rPr>
+        <w:t>Eduardo Matias Ferreira</w:t>
+      </w:r>
+    </w:p>
+    <w:p>
+      <w:pPr>
+        <w:pStyle w:val="Textbody"/>
+        <w:jc w:val="center"/>
+        <w:rPr>
+          <w:rFonts w:ascii="Arial" w:hAnsi="Arial" w:cs="Arial"/>
+          <w:color w:val="000000" w:themeColor="text1"/>
+        </w:rPr>
+      </w:pPr>
+      <w:r>
+        <w:rPr>
+          <w:rFonts w:ascii="Arial" w:hAnsi="Arial" w:cs="Arial"/>
+          <w:color w:val="000000" w:themeColor="text1"/>
+        </w:rPr>
+        <w:t>Poliana da Silva Benedito</w:t>
+      </w:r>
+    </w:p>
+    <w:p>
+      <w:pPr>
+        <w:pStyle w:val="Ttulo2"/>
+        <w:ind w:left="565" w:right="4"/>
+        <w:rPr>
+          <w:rFonts w:ascii="Arial" w:eastAsia="Noto Serif CJK SC" w:hAnsi="Arial" w:cs="Arial"/>
+          <w:b w:val="0"/>
+          <w:bCs w:val="0"/>
+          <w:color w:val="000000" w:themeColor="text1"/>
+          <w:sz w:val="24"/>
+          <w:szCs w:val="24"/>
+          <w:lang w:val="pt-BR" w:eastAsia="zh-CN" w:bidi="hi-IN"/>
+        </w:rPr>
+      </w:pPr>
+      <w:bookmarkStart w:id="0" w:name="2_METODOLOGIA_DA_PESQUISA"/>
+      <w:bookmarkStart w:id="1" w:name="6.3_Oportunidades_de_Melhoria_para_o_Sis"/>
+      <w:bookmarkStart w:id="2" w:name="4.3.5_Segurança"/>
+      <w:bookmarkStart w:id="3" w:name="4.3.4_Usabilidade_e_Experiência_do_Usuár"/>
+      <w:bookmarkStart w:id="4" w:name="4.2.5_Segurança"/>
+      <w:bookmarkStart w:id="5" w:name="4.1.6_Diferenciais"/>
+      <w:bookmarkStart w:id="6" w:name="4.1.1_Informações_Gerais"/>
+      <w:bookmarkStart w:id="7" w:name="4.1_Google_Forms"/>
+      <w:bookmarkStart w:id="8" w:name="4_ANÁLISE_INDIVIDUAL_DOS_SISTEMAS"/>
       <w:bookmarkEnd w:id="0"/>
       <w:bookmarkEnd w:id="1"/>
       <w:bookmarkEnd w:id="2"/>
       <w:bookmarkEnd w:id="3"/>
-      <w:r>
-        <w:t>CENTRO ESTADUAL DE EDUCAÇÃO TECNOLÓGICA PAULA SOUZA</w:t>
-      </w:r>
-    </w:p>
-    <w:p>
-      <w:pPr>
-        <w:pBdr>
-          <w:top w:val="nil"/>
-          <w:left w:val="nil"/>
-          <w:bottom w:val="nil"/>
-          <w:right w:val="nil"/>
-          <w:between w:val="nil"/>
-        </w:pBdr>
-        <w:spacing w:before="146"/>
-        <w:ind w:left="565" w:right="5"/>
-        <w:jc w:val="center"/>
-        <w:rPr>
-          <w:rFonts w:ascii="Arial" w:eastAsia="Arial" w:hAnsi="Arial" w:cs="Arial"/>
-          <w:color w:val="000000"/>
-        </w:rPr>
-      </w:pPr>
-      <w:r>
-        <w:rPr>
-          <w:rFonts w:ascii="Arial" w:eastAsia="Arial" w:hAnsi="Arial" w:cs="Arial"/>
-          <w:b/>
-          <w:bCs/>
-          <w:color w:val="000000"/>
-        </w:rPr>
-        <w:t>Curso de Análise e Desenvolvimento de Sistemas</w:t>
-      </w:r>
-    </w:p>
-    <w:p>
-      <w:pPr>
-        <w:pBdr>
-          <w:top w:val="nil"/>
-          <w:left w:val="nil"/>
-          <w:bottom w:val="nil"/>
-          <w:right w:val="nil"/>
-          <w:between w:val="nil"/>
-        </w:pBdr>
-        <w:spacing w:after="140" w:line="276" w:lineRule="auto"/>
-        <w:jc w:val="center"/>
-        <w:rPr>
-          <w:rFonts w:ascii="Arial" w:eastAsia="Arial" w:hAnsi="Arial" w:cs="Arial"/>
-          <w:b/>
-          <w:bCs/>
-          <w:color w:val="000000"/>
-        </w:rPr>
-      </w:pPr>
-    </w:p>
-    <w:p>
-      <w:pPr>
-        <w:pBdr>
-          <w:top w:val="nil"/>
-          <w:left w:val="nil"/>
-          <w:bottom w:val="nil"/>
-          <w:right w:val="nil"/>
-          <w:between w:val="nil"/>
-        </w:pBdr>
-        <w:spacing w:after="140" w:line="276" w:lineRule="auto"/>
-        <w:jc w:val="center"/>
-        <w:rPr>
-          <w:rFonts w:ascii="Arial" w:eastAsia="Arial" w:hAnsi="Arial" w:cs="Arial"/>
-          <w:color w:val="000000"/>
-        </w:rPr>
-      </w:pPr>
-    </w:p>
-    <w:p>
-      <w:pPr>
-        <w:pBdr>
-          <w:top w:val="nil"/>
-          <w:left w:val="nil"/>
-          <w:bottom w:val="nil"/>
-          <w:right w:val="nil"/>
-          <w:between w:val="nil"/>
-        </w:pBdr>
-        <w:spacing w:after="140" w:line="276" w:lineRule="auto"/>
-        <w:jc w:val="center"/>
-        <w:rPr>
-          <w:rFonts w:ascii="Arial" w:eastAsia="Arial" w:hAnsi="Arial" w:cs="Arial"/>
-          <w:color w:val="000000"/>
-        </w:rPr>
-      </w:pPr>
-    </w:p>
-    <w:p>
-      <w:pPr>
-        <w:pBdr>
-          <w:top w:val="nil"/>
-          <w:left w:val="nil"/>
-          <w:bottom w:val="nil"/>
-          <w:right w:val="nil"/>
-          <w:between w:val="nil"/>
-        </w:pBdr>
-        <w:spacing w:after="140" w:line="276" w:lineRule="auto"/>
-        <w:jc w:val="center"/>
-        <w:rPr>
-          <w:rFonts w:ascii="Arial" w:eastAsia="Arial" w:hAnsi="Arial" w:cs="Arial"/>
-          <w:color w:val="000000"/>
-        </w:rPr>
-      </w:pPr>
-    </w:p>
-    <w:p>
-      <w:pPr>
-        <w:pBdr>
-          <w:top w:val="nil"/>
-          <w:left w:val="nil"/>
-          <w:bottom w:val="nil"/>
-          <w:right w:val="nil"/>
-          <w:between w:val="nil"/>
-        </w:pBdr>
-        <w:spacing w:after="140" w:line="276" w:lineRule="auto"/>
-        <w:jc w:val="center"/>
-        <w:rPr>
-          <w:rFonts w:ascii="Arial" w:eastAsia="Arial" w:hAnsi="Arial" w:cs="Arial"/>
-          <w:color w:val="000000"/>
-        </w:rPr>
-      </w:pPr>
-      <w:r>
-        <w:rPr>
-          <w:rFonts w:ascii="Arial" w:eastAsia="Arial" w:hAnsi="Arial" w:cs="Arial"/>
-          <w:color w:val="000000"/>
-        </w:rPr>
-        <w:t xml:space="preserve">         Anderson Clayton Pereira de Assis</w:t>
-      </w:r>
-    </w:p>
-    <w:p>
-      <w:pPr>
-        <w:pBdr>
-          <w:top w:val="nil"/>
-          <w:left w:val="nil"/>
-          <w:bottom w:val="nil"/>
-          <w:right w:val="nil"/>
-          <w:between w:val="nil"/>
-        </w:pBdr>
-        <w:spacing w:after="140" w:line="276" w:lineRule="auto"/>
-        <w:jc w:val="center"/>
-        <w:rPr>
-          <w:rFonts w:ascii="Arial" w:eastAsia="Arial" w:hAnsi="Arial" w:cs="Arial"/>
-          <w:color w:val="000000"/>
-        </w:rPr>
-      </w:pPr>
-      <w:r>
-        <w:rPr>
-          <w:rFonts w:ascii="Arial" w:eastAsia="Arial" w:hAnsi="Arial" w:cs="Arial"/>
-          <w:color w:val="000000"/>
-        </w:rPr>
-        <w:t xml:space="preserve">      Anderson Porto Abrantes</w:t>
-      </w:r>
-    </w:p>
-    <w:p>
-      <w:pPr>
-        <w:pBdr>
-          <w:top w:val="nil"/>
-          <w:left w:val="nil"/>
-          <w:bottom w:val="nil"/>
-          <w:right w:val="nil"/>
-          <w:between w:val="nil"/>
-        </w:pBdr>
-        <w:spacing w:after="140" w:line="276" w:lineRule="auto"/>
-        <w:jc w:val="center"/>
-        <w:rPr>
-          <w:rFonts w:ascii="Arial" w:eastAsia="Arial" w:hAnsi="Arial" w:cs="Arial"/>
-          <w:color w:val="000000"/>
-        </w:rPr>
-      </w:pPr>
-      <w:r>
-        <w:rPr>
-          <w:rFonts w:ascii="Arial" w:eastAsia="Arial" w:hAnsi="Arial" w:cs="Arial"/>
-          <w:color w:val="000000"/>
-        </w:rPr>
-        <w:t xml:space="preserve">     Eduardo Matias Ferreira</w:t>
-      </w:r>
-    </w:p>
-    <w:p>
-      <w:pPr>
-        <w:pBdr>
-          <w:top w:val="nil"/>
-          <w:left w:val="nil"/>
-          <w:bottom w:val="nil"/>
-          <w:right w:val="nil"/>
-          <w:between w:val="nil"/>
-        </w:pBdr>
-        <w:spacing w:after="140" w:line="276" w:lineRule="auto"/>
-        <w:jc w:val="center"/>
-        <w:rPr>
-          <w:rFonts w:ascii="Arial" w:eastAsia="Arial" w:hAnsi="Arial" w:cs="Arial"/>
-          <w:color w:val="000000"/>
-        </w:rPr>
-      </w:pPr>
-      <w:r>
-        <w:rPr>
-          <w:rFonts w:ascii="Arial" w:eastAsia="Arial" w:hAnsi="Arial" w:cs="Arial"/>
-          <w:color w:val="000000"/>
-        </w:rPr>
-        <w:t xml:space="preserve">       Poliana da Silva Benedito</w:t>
-      </w:r>
-    </w:p>
-    <w:p>
-      <w:pPr>
-        <w:pStyle w:val="Ttulo2"/>
-        <w:ind w:left="565" w:right="4" w:firstLine="0"/>
-        <w:rPr>
-          <w:rFonts w:ascii="Arial" w:eastAsia="Arial" w:hAnsi="Arial" w:cs="Arial"/>
-          <w:b w:val="0"/>
-          <w:bCs w:val="0"/>
-          <w:sz w:val="24"/>
-          <w:szCs w:val="24"/>
-        </w:rPr>
-      </w:pPr>
-      <w:bookmarkStart w:id="4" w:name="7osbhmnkulsw" w:colFirst="0" w:colLast="0"/>
-      <w:bookmarkStart w:id="5" w:name="bdwpphyg2993" w:colFirst="0" w:colLast="0"/>
-      <w:bookmarkStart w:id="6" w:name="g703gvvw5d4o" w:colFirst="0" w:colLast="0"/>
-      <w:bookmarkStart w:id="7" w:name="cxpmynjwgl1n" w:colFirst="0" w:colLast="0"/>
-      <w:bookmarkStart w:id="8" w:name="gvk5qkb8p5n7" w:colFirst="0" w:colLast="0"/>
-      <w:bookmarkStart w:id="9" w:name="i6gi11z0i9b9" w:colFirst="0" w:colLast="0"/>
-      <w:bookmarkStart w:id="10" w:name="lx44pvgl54zp" w:colFirst="0" w:colLast="0"/>
-      <w:bookmarkStart w:id="11" w:name="hjxkt3z47pkr" w:colFirst="0" w:colLast="0"/>
-      <w:bookmarkStart w:id="12" w:name="7aexx6wno0ts" w:colFirst="0" w:colLast="0"/>
       <w:bookmarkEnd w:id="4"/>
       <w:bookmarkEnd w:id="5"/>
       <w:bookmarkEnd w:id="6"/>
       <w:bookmarkEnd w:id="7"/>
       <w:bookmarkEnd w:id="8"/>
-      <w:bookmarkEnd w:id="9"/>
-      <w:bookmarkEnd w:id="10"/>
-      <w:bookmarkEnd w:id="11"/>
-      <w:bookmarkEnd w:id="12"/>
     </w:p>
     <w:p>
       <w:pPr>
         <w:pStyle w:val="Ttulo2"/>
-        <w:ind w:left="565" w:right="4" w:firstLine="0"/>
-        <w:rPr>
-          <w:rFonts w:ascii="Arial" w:eastAsia="Arial" w:hAnsi="Arial" w:cs="Arial"/>
+        <w:ind w:left="565" w:right="4"/>
+        <w:rPr>
+          <w:rFonts w:ascii="Arial" w:hAnsi="Arial" w:cs="Arial"/>
+          <w:color w:val="000000" w:themeColor="text1"/>
         </w:rPr>
       </w:pPr>
     </w:p>
     <w:p>
       <w:pPr>
         <w:pStyle w:val="Ttulo2"/>
-        <w:ind w:left="565" w:right="4" w:firstLine="0"/>
-        <w:rPr>
-          <w:rFonts w:ascii="Arial" w:eastAsia="Arial" w:hAnsi="Arial" w:cs="Arial"/>
+        <w:ind w:left="565" w:right="4"/>
+        <w:rPr>
+          <w:rFonts w:ascii="Arial" w:hAnsi="Arial" w:cs="Arial"/>
+          <w:color w:val="000000" w:themeColor="text1"/>
         </w:rPr>
       </w:pPr>
     </w:p>
     <w:p>
       <w:pPr>
         <w:pStyle w:val="Ttulo2"/>
-        <w:ind w:left="565" w:right="4" w:firstLine="0"/>
-        <w:rPr>
-          <w:rFonts w:ascii="Arial" w:eastAsia="Arial" w:hAnsi="Arial" w:cs="Arial"/>
+        <w:ind w:left="565" w:right="4"/>
+        <w:rPr>
+          <w:rFonts w:ascii="Arial" w:hAnsi="Arial" w:cs="Arial"/>
+          <w:color w:val="000000" w:themeColor="text1"/>
         </w:rPr>
       </w:pPr>
     </w:p>
     <w:p>
       <w:pPr>
         <w:pStyle w:val="Ttulo2"/>
-        <w:ind w:left="565" w:right="4" w:firstLine="0"/>
-        <w:rPr>
-          <w:rFonts w:ascii="Arial" w:eastAsia="Arial" w:hAnsi="Arial" w:cs="Arial"/>
+        <w:ind w:left="565" w:right="4"/>
+        <w:rPr>
+          <w:rFonts w:ascii="Arial" w:hAnsi="Arial" w:cs="Arial"/>
+          <w:color w:val="000000" w:themeColor="text1"/>
         </w:rPr>
       </w:pPr>
     </w:p>
     <w:p>
       <w:pPr>
         <w:pStyle w:val="Ttulo2"/>
-        <w:ind w:left="565" w:right="4" w:firstLine="0"/>
-        <w:rPr>
-          <w:rFonts w:ascii="Arial" w:eastAsia="Arial" w:hAnsi="Arial" w:cs="Arial"/>
+        <w:ind w:left="565" w:right="4"/>
+        <w:rPr>
+          <w:rFonts w:ascii="Arial" w:hAnsi="Arial" w:cs="Arial"/>
+          <w:color w:val="000000" w:themeColor="text1"/>
         </w:rPr>
       </w:pPr>
     </w:p>
     <w:p>
       <w:pPr>
         <w:pStyle w:val="Ttulo2"/>
-        <w:ind w:left="565" w:right="4" w:firstLine="0"/>
-        <w:rPr>
-          <w:rFonts w:ascii="Arial" w:eastAsia="Arial" w:hAnsi="Arial" w:cs="Arial"/>
+        <w:ind w:left="565" w:right="4"/>
+        <w:rPr>
+          <w:rFonts w:ascii="Arial" w:hAnsi="Arial" w:cs="Arial"/>
+          <w:color w:val="000000" w:themeColor="text1"/>
         </w:rPr>
       </w:pPr>
     </w:p>
     <w:p>
       <w:pPr>
         <w:pStyle w:val="Ttulo2"/>
-        <w:ind w:left="565" w:right="4" w:firstLine="0"/>
-        <w:rPr>
-          <w:rFonts w:ascii="Arial" w:eastAsia="Arial" w:hAnsi="Arial" w:cs="Arial"/>
+        <w:ind w:left="565" w:right="4"/>
+        <w:rPr>
+          <w:rFonts w:ascii="Arial" w:hAnsi="Arial" w:cs="Arial"/>
+          <w:color w:val="000000" w:themeColor="text1"/>
         </w:rPr>
       </w:pPr>
     </w:p>
     <w:p>
       <w:pPr>
         <w:pStyle w:val="Ttulo2"/>
-        <w:ind w:left="565" w:right="4" w:firstLine="0"/>
-        <w:rPr>
-          <w:rFonts w:ascii="Arial" w:eastAsia="Arial" w:hAnsi="Arial" w:cs="Arial"/>
-        </w:rPr>
-      </w:pPr>
-    </w:p>
-    <w:p>
-      <w:pPr>
-        <w:pStyle w:val="Ttulo2"/>
-        <w:ind w:left="565" w:right="4" w:firstLine="0"/>
-        <w:rPr>
-          <w:rFonts w:ascii="Arial" w:eastAsia="Arial" w:hAnsi="Arial" w:cs="Arial"/>
-        </w:rPr>
-      </w:pPr>
-      <w:r>
-        <w:rPr>
-          <w:rFonts w:ascii="Arial" w:eastAsia="Arial" w:hAnsi="Arial" w:cs="Arial"/>
+        <w:ind w:left="565" w:right="4"/>
+        <w:rPr>
+          <w:rFonts w:ascii="Arial" w:hAnsi="Arial" w:cs="Arial"/>
+          <w:color w:val="000000" w:themeColor="text1"/>
+        </w:rPr>
+      </w:pPr>
+    </w:p>
+    <w:p>
+      <w:pPr>
+        <w:pStyle w:val="Textbody"/>
+        <w:spacing w:line="360" w:lineRule="auto"/>
+        <w:jc w:val="center"/>
+        <w:rPr>
+          <w:rFonts w:ascii="Arial" w:hAnsi="Arial" w:cs="Arial"/>
+          <w:b/>
+          <w:color w:val="000000" w:themeColor="text1"/>
+        </w:rPr>
+      </w:pPr>
+      <w:r>
+        <w:rPr>
+          <w:rFonts w:ascii="Arial" w:hAnsi="Arial" w:cs="Arial"/>
+          <w:b/>
+          <w:color w:val="000000" w:themeColor="text1"/>
         </w:rPr>
         <w:t>ESTUDO DE CASO</w:t>
       </w:r>
     </w:p>
     <w:p>
       <w:pPr>
-        <w:pBdr>
-          <w:top w:val="nil"/>
-          <w:left w:val="nil"/>
-          <w:bottom w:val="nil"/>
-          <w:right w:val="nil"/>
-          <w:between w:val="nil"/>
-        </w:pBdr>
-        <w:spacing w:before="320" w:line="276" w:lineRule="auto"/>
-        <w:ind w:left="565"/>
+        <w:pStyle w:val="Textbody"/>
+        <w:spacing w:line="360" w:lineRule="auto"/>
         <w:jc w:val="center"/>
         <w:rPr>
-          <w:rFonts w:ascii="Arial" w:eastAsia="Arial" w:hAnsi="Arial" w:cs="Arial"/>
-          <w:color w:val="000000"/>
-        </w:rPr>
-      </w:pPr>
-      <w:bookmarkStart w:id="13" w:name="spizu2l8d1kx" w:colFirst="0" w:colLast="0"/>
-      <w:bookmarkStart w:id="14" w:name="f76y4mjxmvha" w:colFirst="0" w:colLast="0"/>
-      <w:bookmarkEnd w:id="13"/>
-      <w:bookmarkEnd w:id="14"/>
-      <w:r>
-        <w:rPr>
-          <w:rFonts w:ascii="Arial" w:eastAsia="Arial" w:hAnsi="Arial" w:cs="Arial"/>
-          <w:color w:val="000000"/>
-        </w:rPr>
-        <w:t xml:space="preserve">  Levantamento e Análise de Requisitos</w:t>
-      </w:r>
-    </w:p>
-    <w:p>
-      <w:pPr>
-        <w:pBdr>
-          <w:top w:val="nil"/>
-          <w:left w:val="nil"/>
-          <w:bottom w:val="nil"/>
-          <w:right w:val="nil"/>
-          <w:between w:val="nil"/>
-        </w:pBdr>
-        <w:spacing w:after="140" w:line="276" w:lineRule="auto"/>
+          <w:rFonts w:ascii="Arial" w:hAnsi="Arial" w:cs="Arial"/>
+          <w:color w:val="000000" w:themeColor="text1"/>
+        </w:rPr>
+      </w:pPr>
+      <w:r>
+        <w:rPr>
+          <w:rFonts w:ascii="Arial" w:hAnsi="Arial" w:cs="Arial"/>
+          <w:color w:val="000000" w:themeColor="text1"/>
+        </w:rPr>
+        <w:t xml:space="preserve">Levantamento e </w:t>
+      </w:r>
+      <w:r>
+        <w:rPr>
+          <w:rFonts w:ascii="Arial" w:hAnsi="Arial" w:cs="Arial"/>
+          <w:color w:val="000000" w:themeColor="text1"/>
+        </w:rPr>
+        <w:t xml:space="preserve">Análise de </w:t>
+      </w:r>
+      <w:r>
+        <w:rPr>
+          <w:rFonts w:ascii="Arial" w:hAnsi="Arial" w:cs="Arial"/>
+          <w:color w:val="000000" w:themeColor="text1"/>
+        </w:rPr>
+        <w:t>Requisitos</w:t>
+      </w:r>
+    </w:p>
+    <w:p>
+      <w:pPr>
+        <w:pStyle w:val="Textbody"/>
         <w:jc w:val="center"/>
         <w:rPr>
-          <w:rFonts w:ascii="Arial" w:eastAsia="Arial" w:hAnsi="Arial" w:cs="Arial"/>
-          <w:color w:val="000000"/>
-        </w:rPr>
-      </w:pPr>
-    </w:p>
-    <w:p>
-      <w:pPr>
-        <w:pBdr>
-          <w:top w:val="nil"/>
-          <w:left w:val="nil"/>
-          <w:bottom w:val="nil"/>
-          <w:right w:val="nil"/>
-          <w:between w:val="nil"/>
-        </w:pBdr>
-        <w:spacing w:after="140" w:line="276" w:lineRule="auto"/>
+          <w:rFonts w:ascii="Arial" w:hAnsi="Arial" w:cs="Arial"/>
+          <w:color w:val="000000" w:themeColor="text1"/>
+        </w:rPr>
+      </w:pPr>
+    </w:p>
+    <w:p>
+      <w:pPr>
+        <w:pStyle w:val="Textbody"/>
         <w:jc w:val="center"/>
         <w:rPr>
-          <w:rFonts w:ascii="Arial" w:eastAsia="Arial" w:hAnsi="Arial" w:cs="Arial"/>
-          <w:color w:val="000000"/>
-        </w:rPr>
-      </w:pPr>
-    </w:p>
-    <w:p>
-      <w:pPr>
-        <w:pBdr>
-          <w:top w:val="nil"/>
-          <w:left w:val="nil"/>
-          <w:bottom w:val="nil"/>
-          <w:right w:val="nil"/>
-          <w:between w:val="nil"/>
-        </w:pBdr>
-        <w:spacing w:after="140" w:line="276" w:lineRule="auto"/>
+          <w:rFonts w:ascii="Arial" w:hAnsi="Arial" w:cs="Arial"/>
+          <w:color w:val="000000" w:themeColor="text1"/>
+        </w:rPr>
+      </w:pPr>
+    </w:p>
+    <w:p>
+      <w:pPr>
+        <w:pStyle w:val="Textbody"/>
         <w:jc w:val="center"/>
         <w:rPr>
-          <w:rFonts w:ascii="Arial" w:eastAsia="Arial" w:hAnsi="Arial" w:cs="Arial"/>
-          <w:color w:val="000000"/>
-        </w:rPr>
-      </w:pPr>
-    </w:p>
-    <w:p>
-      <w:pPr>
-        <w:pBdr>
-          <w:top w:val="nil"/>
-          <w:left w:val="nil"/>
-          <w:bottom w:val="nil"/>
-          <w:right w:val="nil"/>
-          <w:between w:val="nil"/>
-        </w:pBdr>
-        <w:spacing w:after="140" w:line="276" w:lineRule="auto"/>
+          <w:rFonts w:ascii="Arial" w:hAnsi="Arial" w:cs="Arial"/>
+          <w:color w:val="000000" w:themeColor="text1"/>
+        </w:rPr>
+      </w:pPr>
+    </w:p>
+    <w:p>
+      <w:pPr>
+        <w:pStyle w:val="Textbody"/>
         <w:jc w:val="center"/>
         <w:rPr>
-          <w:rFonts w:ascii="Arial" w:eastAsia="Arial" w:hAnsi="Arial" w:cs="Arial"/>
-          <w:color w:val="000000"/>
-        </w:rPr>
-      </w:pPr>
-    </w:p>
-    <w:p>
-      <w:pPr>
-        <w:pBdr>
-          <w:top w:val="nil"/>
-          <w:left w:val="nil"/>
-          <w:bottom w:val="nil"/>
-          <w:right w:val="nil"/>
-          <w:between w:val="nil"/>
-        </w:pBdr>
-        <w:spacing w:after="140" w:line="276" w:lineRule="auto"/>
+          <w:rFonts w:ascii="Arial" w:hAnsi="Arial" w:cs="Arial"/>
+          <w:color w:val="000000" w:themeColor="text1"/>
+        </w:rPr>
+      </w:pPr>
+    </w:p>
+    <w:p>
+      <w:pPr>
+        <w:pStyle w:val="Textbody"/>
         <w:jc w:val="center"/>
         <w:rPr>
-          <w:rFonts w:ascii="Arial" w:eastAsia="Arial" w:hAnsi="Arial" w:cs="Arial"/>
-          <w:color w:val="000000"/>
-        </w:rPr>
-      </w:pPr>
-    </w:p>
-    <w:p>
-      <w:pPr>
-        <w:pBdr>
-          <w:top w:val="nil"/>
-          <w:left w:val="nil"/>
-          <w:bottom w:val="nil"/>
-          <w:right w:val="nil"/>
-          <w:between w:val="nil"/>
-        </w:pBdr>
-        <w:spacing w:after="140" w:line="276" w:lineRule="auto"/>
+          <w:rFonts w:ascii="Arial" w:hAnsi="Arial" w:cs="Arial"/>
+          <w:color w:val="000000" w:themeColor="text1"/>
+        </w:rPr>
+      </w:pPr>
+    </w:p>
+    <w:p>
+      <w:pPr>
+        <w:pStyle w:val="Textbody"/>
         <w:jc w:val="center"/>
         <w:rPr>
-          <w:rFonts w:ascii="Arial" w:eastAsia="Arial" w:hAnsi="Arial" w:cs="Arial"/>
-          <w:color w:val="000000"/>
-        </w:rPr>
-      </w:pPr>
-    </w:p>
-    <w:p>
-      <w:pPr>
-        <w:pBdr>
-          <w:top w:val="nil"/>
-          <w:left w:val="nil"/>
-          <w:bottom w:val="nil"/>
-          <w:right w:val="nil"/>
-          <w:between w:val="nil"/>
-        </w:pBdr>
-        <w:spacing w:after="140" w:line="276" w:lineRule="auto"/>
+          <w:rFonts w:ascii="Arial" w:hAnsi="Arial" w:cs="Arial"/>
+          <w:color w:val="000000" w:themeColor="text1"/>
+        </w:rPr>
+      </w:pPr>
+    </w:p>
+    <w:p>
+      <w:pPr>
+        <w:pStyle w:val="Textbody"/>
         <w:jc w:val="center"/>
         <w:rPr>
-          <w:rFonts w:ascii="Arial" w:eastAsia="Arial" w:hAnsi="Arial" w:cs="Arial"/>
-          <w:color w:val="000000"/>
-        </w:rPr>
-      </w:pPr>
-    </w:p>
-    <w:p>
-      <w:pPr>
-        <w:pBdr>
-          <w:top w:val="nil"/>
-          <w:left w:val="nil"/>
-          <w:bottom w:val="nil"/>
-          <w:right w:val="nil"/>
-          <w:between w:val="nil"/>
-        </w:pBdr>
-        <w:spacing w:after="140" w:line="276" w:lineRule="auto"/>
+          <w:rFonts w:ascii="Arial" w:hAnsi="Arial" w:cs="Arial"/>
+          <w:color w:val="000000" w:themeColor="text1"/>
+        </w:rPr>
+      </w:pPr>
+    </w:p>
+    <w:p>
+      <w:pPr>
+        <w:pStyle w:val="Textbody"/>
         <w:jc w:val="center"/>
         <w:rPr>
-          <w:rFonts w:ascii="Arial" w:eastAsia="Arial" w:hAnsi="Arial" w:cs="Arial"/>
-          <w:color w:val="000000"/>
-        </w:rPr>
-      </w:pPr>
-    </w:p>
-    <w:p>
-      <w:pPr>
-        <w:pBdr>
-          <w:top w:val="nil"/>
-          <w:left w:val="nil"/>
-          <w:bottom w:val="nil"/>
-          <w:right w:val="nil"/>
-          <w:between w:val="nil"/>
-        </w:pBdr>
-        <w:spacing w:after="140" w:line="276" w:lineRule="auto"/>
-        <w:rPr>
-          <w:rFonts w:ascii="Arial" w:eastAsia="Arial" w:hAnsi="Arial" w:cs="Arial"/>
-          <w:color w:val="000000"/>
-        </w:rPr>
-      </w:pPr>
-    </w:p>
-    <w:p>
-      <w:pPr>
-        <w:pBdr>
-          <w:top w:val="nil"/>
-          <w:left w:val="nil"/>
-          <w:bottom w:val="nil"/>
-          <w:right w:val="nil"/>
-          <w:between w:val="nil"/>
-        </w:pBdr>
+          <w:rFonts w:ascii="Arial" w:hAnsi="Arial" w:cs="Arial"/>
+          <w:color w:val="000000" w:themeColor="text1"/>
+        </w:rPr>
+      </w:pPr>
+    </w:p>
+    <w:p>
+      <w:pPr>
+        <w:pStyle w:val="Standard"/>
         <w:spacing w:line="480" w:lineRule="auto"/>
         <w:ind w:left="4942" w:right="4373"/>
         <w:jc w:val="center"/>
         <w:rPr>
-          <w:rFonts w:ascii="Arial" w:eastAsia="Arial" w:hAnsi="Arial" w:cs="Arial"/>
+          <w:rFonts w:ascii="Arial" w:hAnsi="Arial" w:cs="Arial"/>
+          <w:b/>
+          <w:color w:val="000000" w:themeColor="text1"/>
+          <w:spacing w:val="-2"/>
+        </w:rPr>
+      </w:pPr>
+    </w:p>
+    <w:p>
+      <w:pPr>
+        <w:jc w:val="center"/>
+        <w:rPr>
+          <w:rFonts w:ascii="Arial" w:hAnsi="Arial" w:cs="Arial"/>
           <w:b/>
           <w:bCs/>
-          <w:color w:val="000000"/>
-        </w:rPr>
-      </w:pPr>
-    </w:p>
-    <w:p>
-      <w:pPr>
-        <w:pBdr>
-          <w:top w:val="nil"/>
-          <w:left w:val="nil"/>
-          <w:bottom w:val="nil"/>
-          <w:right w:val="nil"/>
-          <w:between w:val="nil"/>
-        </w:pBdr>
+        </w:rPr>
+      </w:pPr>
+      <w:bookmarkStart w:id="9" w:name="3.3_LimeSurvey"/>
+      <w:bookmarkEnd w:id="9"/>
+    </w:p>
+    <w:p>
+      <w:pPr>
+        <w:jc w:val="center"/>
+        <w:rPr>
+          <w:rFonts w:ascii="Arial" w:hAnsi="Arial" w:cs="Arial"/>
+          <w:b/>
+          <w:bCs/>
+        </w:rPr>
+      </w:pPr>
+    </w:p>
+    <w:p>
+      <w:pPr>
+        <w:jc w:val="center"/>
+        <w:rPr>
+          <w:rFonts w:ascii="Arial" w:hAnsi="Arial" w:cs="Arial"/>
+        </w:rPr>
+      </w:pPr>
+      <w:r>
+        <w:rPr>
+          <w:rFonts w:ascii="Arial" w:hAnsi="Arial" w:cs="Arial"/>
+          <w:b/>
+          <w:bCs/>
+        </w:rPr>
+        <w:t>LINS/SP</w:t>
+      </w:r>
+    </w:p>
+    <w:p>
+      <w:pPr>
+        <w:jc w:val="center"/>
+        <w:rPr>
+          <w:rFonts w:ascii="Arial" w:hAnsi="Arial" w:cs="Arial"/>
+        </w:rPr>
+      </w:pPr>
+      <w:r>
+        <w:rPr>
+          <w:rFonts w:ascii="Arial" w:hAnsi="Arial" w:cs="Arial"/>
+          <w:b/>
+          <w:bCs/>
+        </w:rPr>
+        <w:t>1º SEMESTRE/2026</w:t>
+      </w:r>
+    </w:p>
+    <w:p>
+      <w:pPr>
+        <w:pStyle w:val="Standard"/>
         <w:spacing w:line="480" w:lineRule="auto"/>
         <w:ind w:left="4942" w:right="4373"/>
         <w:jc w:val="center"/>
         <w:rPr>
-          <w:color w:val="000000"/>
+          <w:rFonts w:hint="eastAsia"/>
+          <w:color w:val="000000" w:themeColor="text1"/>
         </w:rPr>
         <w:sectPr>
-          <w:headerReference w:type="default" r:id="rId7"/>
+          <w:footerReference w:type="default" r:id="rId7"/>
           <w:pgSz w:w="11906" w:h="16838"/>
-          <w:pgMar w:top="1600" w:right="705" w:bottom="280" w:left="708" w:header="720" w:footer="720" w:gutter="0"/>
-          <w:pgNumType w:start="1"/>
+          <w:pgMar w:top="1701" w:right="1134" w:bottom="1134" w:left="1701" w:header="720" w:footer="720" w:gutter="0"/>
           <w:cols w:space="720"/>
         </w:sectPr>
       </w:pPr>
-      <w:bookmarkStart w:id="15" w:name="4qqae14crna7" w:colFirst="0" w:colLast="0"/>
-      <w:bookmarkEnd w:id="15"/>
-      <w:r>
-        <w:rPr>
-          <w:rFonts w:ascii="Arial" w:eastAsia="Arial" w:hAnsi="Arial" w:cs="Arial"/>
-          <w:color w:val="000000"/>
-        </w:rPr>
-        <w:tab/>
-      </w:r>
-      <w:r>
-        <w:rPr>
-          <w:rFonts w:ascii="Arial" w:eastAsia="Arial" w:hAnsi="Arial" w:cs="Arial"/>
+    </w:p>
+    <w:p>
+      <w:pPr>
+        <w:pStyle w:val="Textbody"/>
+        <w:tabs>
+          <w:tab w:val="left" w:pos="2606"/>
+        </w:tabs>
+        <w:jc w:val="center"/>
+        <w:rPr>
+          <w:rFonts w:ascii="Arial" w:hAnsi="Arial" w:cs="Arial"/>
+          <w:color w:val="000000" w:themeColor="text1"/>
+        </w:rPr>
+      </w:pPr>
+    </w:p>
+    <w:p>
+      <w:pPr>
+        <w:pStyle w:val="Textbody"/>
+        <w:jc w:val="center"/>
+        <w:rPr>
+          <w:rFonts w:ascii="Arial" w:hAnsi="Arial" w:cs="Arial"/>
+          <w:color w:val="000000" w:themeColor="text1"/>
+        </w:rPr>
+      </w:pPr>
+      <w:r>
+        <w:rPr>
+          <w:rFonts w:ascii="Arial" w:hAnsi="Arial" w:cs="Arial"/>
+          <w:color w:val="000000" w:themeColor="text1"/>
+        </w:rPr>
+        <w:t>Anderson Clayton Pereira de Assis</w:t>
+      </w:r>
+    </w:p>
+    <w:p>
+      <w:pPr>
+        <w:pStyle w:val="Textbody"/>
+        <w:jc w:val="center"/>
+        <w:rPr>
+          <w:rFonts w:ascii="Arial" w:hAnsi="Arial" w:cs="Arial"/>
+          <w:color w:val="000000" w:themeColor="text1"/>
+        </w:rPr>
+      </w:pPr>
+      <w:r>
+        <w:rPr>
+          <w:rFonts w:ascii="Arial" w:hAnsi="Arial" w:cs="Arial"/>
+          <w:color w:val="000000" w:themeColor="text1"/>
+        </w:rPr>
+        <w:t>Anderson Porto Abrantes</w:t>
+      </w:r>
+    </w:p>
+    <w:p>
+      <w:pPr>
+        <w:pStyle w:val="Textbody"/>
+        <w:jc w:val="center"/>
+        <w:rPr>
+          <w:rFonts w:ascii="Arial" w:hAnsi="Arial" w:cs="Arial"/>
+          <w:color w:val="000000" w:themeColor="text1"/>
+        </w:rPr>
+      </w:pPr>
+      <w:r>
+        <w:rPr>
+          <w:rFonts w:ascii="Arial" w:hAnsi="Arial" w:cs="Arial"/>
+          <w:color w:val="000000" w:themeColor="text1"/>
+        </w:rPr>
+        <w:t>Eduardo Matias Ferreira</w:t>
+      </w:r>
+    </w:p>
+    <w:p>
+      <w:pPr>
+        <w:pStyle w:val="Textbody"/>
+        <w:jc w:val="center"/>
+        <w:rPr>
+          <w:rFonts w:ascii="Arial" w:hAnsi="Arial" w:cs="Arial"/>
+          <w:color w:val="000000" w:themeColor="text1"/>
+        </w:rPr>
+      </w:pPr>
+      <w:r>
+        <w:rPr>
+          <w:rFonts w:ascii="Arial" w:hAnsi="Arial" w:cs="Arial"/>
+          <w:color w:val="000000" w:themeColor="text1"/>
+        </w:rPr>
+        <w:t>Poliana da Silva Benedito</w:t>
+      </w:r>
+    </w:p>
+    <w:p>
+      <w:pPr>
+        <w:pStyle w:val="Textbody"/>
+        <w:jc w:val="center"/>
+        <w:rPr>
+          <w:rFonts w:ascii="Arial" w:hAnsi="Arial" w:cs="Arial"/>
+          <w:color w:val="000000" w:themeColor="text1"/>
+        </w:rPr>
+      </w:pPr>
+    </w:p>
+    <w:p>
+      <w:pPr>
+        <w:pStyle w:val="Textbody"/>
+        <w:rPr>
+          <w:rFonts w:ascii="Arial" w:hAnsi="Arial" w:cs="Arial"/>
+          <w:color w:val="000000" w:themeColor="text1"/>
+        </w:rPr>
+      </w:pPr>
+    </w:p>
+    <w:p>
+      <w:pPr>
+        <w:pStyle w:val="Textbody"/>
+        <w:rPr>
+          <w:rFonts w:ascii="Arial" w:hAnsi="Arial" w:cs="Arial"/>
+          <w:color w:val="000000" w:themeColor="text1"/>
+        </w:rPr>
+      </w:pPr>
+    </w:p>
+    <w:p>
+      <w:pPr>
+        <w:pStyle w:val="Textbody"/>
+        <w:rPr>
+          <w:rFonts w:ascii="Arial" w:hAnsi="Arial" w:cs="Arial"/>
+          <w:color w:val="000000" w:themeColor="text1"/>
+        </w:rPr>
+      </w:pPr>
+    </w:p>
+    <w:p>
+      <w:pPr>
+        <w:pStyle w:val="Textbody"/>
+        <w:spacing w:line="360" w:lineRule="auto"/>
+        <w:jc w:val="center"/>
+        <w:rPr>
+          <w:rFonts w:ascii="Arial" w:hAnsi="Arial" w:cs="Arial"/>
+          <w:b/>
+          <w:color w:val="000000" w:themeColor="text1"/>
+        </w:rPr>
+      </w:pPr>
+      <w:r>
+        <w:rPr>
+          <w:rFonts w:ascii="Arial" w:hAnsi="Arial" w:cs="Arial"/>
+          <w:b/>
+          <w:color w:val="000000" w:themeColor="text1"/>
+        </w:rPr>
+        <w:t>ESTUDO DE CASO</w:t>
+      </w:r>
+    </w:p>
+    <w:p>
+      <w:pPr>
+        <w:pStyle w:val="Textbody"/>
+        <w:spacing w:line="360" w:lineRule="auto"/>
+        <w:jc w:val="center"/>
+        <w:rPr>
+          <w:rFonts w:ascii="Arial" w:hAnsi="Arial" w:cs="Arial"/>
+          <w:color w:val="000000" w:themeColor="text1"/>
+        </w:rPr>
+      </w:pPr>
+      <w:r>
+        <w:rPr>
+          <w:rFonts w:ascii="Arial" w:hAnsi="Arial" w:cs="Arial"/>
+          <w:color w:val="000000" w:themeColor="text1"/>
+        </w:rPr>
+        <w:t xml:space="preserve">Levantamento e </w:t>
+      </w:r>
+      <w:r>
+        <w:rPr>
+          <w:rFonts w:ascii="Arial" w:hAnsi="Arial" w:cs="Arial"/>
+          <w:color w:val="000000" w:themeColor="text1"/>
+        </w:rPr>
+        <w:t xml:space="preserve">Análise de </w:t>
+      </w:r>
+      <w:r>
+        <w:rPr>
+          <w:rFonts w:ascii="Arial" w:hAnsi="Arial" w:cs="Arial"/>
+          <w:color w:val="000000" w:themeColor="text1"/>
+        </w:rPr>
+        <w:t>Requisitos</w:t>
+      </w:r>
+    </w:p>
+    <w:p>
+      <w:pPr>
+        <w:pStyle w:val="Textbody"/>
+        <w:tabs>
+          <w:tab w:val="left" w:pos="5743"/>
+        </w:tabs>
+        <w:spacing w:line="360" w:lineRule="auto"/>
+        <w:jc w:val="center"/>
+        <w:rPr>
+          <w:rFonts w:ascii="Arial" w:hAnsi="Arial" w:cs="Arial"/>
+          <w:color w:val="000000" w:themeColor="text1"/>
+        </w:rPr>
+      </w:pPr>
+    </w:p>
+    <w:p>
+      <w:pPr>
+        <w:pStyle w:val="Textbody"/>
+        <w:spacing w:line="360" w:lineRule="auto"/>
+        <w:jc w:val="both"/>
+        <w:rPr>
+          <w:rFonts w:ascii="Arial" w:hAnsi="Arial" w:cs="Arial"/>
+          <w:color w:val="000000" w:themeColor="text1"/>
+        </w:rPr>
+      </w:pPr>
+    </w:p>
+    <w:p>
+      <w:pPr>
+        <w:pStyle w:val="Textbody"/>
+        <w:spacing w:line="360" w:lineRule="auto"/>
+        <w:jc w:val="both"/>
+        <w:rPr>
+          <w:rFonts w:ascii="Arial" w:hAnsi="Arial" w:cs="Arial"/>
+          <w:color w:val="000000" w:themeColor="text1"/>
+        </w:rPr>
+      </w:pPr>
+    </w:p>
+    <w:p>
+      <w:pPr>
+        <w:pStyle w:val="Textbody"/>
+        <w:spacing w:line="480" w:lineRule="auto"/>
+        <w:ind w:left="4536" w:right="425"/>
+        <w:jc w:val="both"/>
+        <w:rPr>
+          <w:rFonts w:ascii="Arial" w:hAnsi="Arial" w:cs="Arial"/>
+          <w:color w:val="000000" w:themeColor="text1"/>
+        </w:rPr>
+      </w:pPr>
+      <w:r>
+        <w:rPr>
+          <w:rFonts w:ascii="Arial" w:hAnsi="Arial" w:cs="Arial"/>
+          <w:color w:val="000000" w:themeColor="text1"/>
+        </w:rPr>
+        <w:t xml:space="preserve">Estudo de caso apresentado como atividade avaliativa da disciplina de Engenharia de Software do curso superior em Análise e Desenvolvimento de Sistemas do Centro Estadual de Educação Tecnológica Paula </w:t>
+      </w:r>
+      <w:r>
+        <w:rPr>
+          <w:rFonts w:ascii="Arial" w:hAnsi="Arial" w:cs="Arial"/>
+          <w:color w:val="000000" w:themeColor="text1"/>
+          <w:spacing w:val="-2"/>
+        </w:rPr>
+        <w:t>Souza.</w:t>
+      </w:r>
+    </w:p>
+    <w:p>
+      <w:pPr>
+        <w:pStyle w:val="Textbody"/>
+        <w:spacing w:before="1" w:after="0" w:line="480" w:lineRule="auto"/>
+        <w:ind w:left="4536" w:right="428"/>
+        <w:jc w:val="both"/>
+        <w:rPr>
+          <w:rFonts w:ascii="Arial" w:hAnsi="Arial" w:cs="Arial"/>
+          <w:color w:val="000000" w:themeColor="text1"/>
+          <w:spacing w:val="-2"/>
+        </w:rPr>
+      </w:pPr>
+      <w:r>
+        <w:rPr>
+          <w:rFonts w:ascii="Arial" w:hAnsi="Arial" w:cs="Arial"/>
+          <w:color w:val="000000" w:themeColor="text1"/>
+        </w:rPr>
+        <w:t xml:space="preserve">Professor: </w:t>
+      </w:r>
+      <w:proofErr w:type="spellStart"/>
+      <w:r>
+        <w:rPr>
+          <w:rFonts w:ascii="Arial" w:hAnsi="Arial" w:cs="Arial"/>
+          <w:color w:val="000000" w:themeColor="text1"/>
+        </w:rPr>
+        <w:t>Alciano</w:t>
+      </w:r>
+      <w:proofErr w:type="spellEnd"/>
+      <w:r>
+        <w:rPr>
+          <w:rFonts w:ascii="Arial" w:hAnsi="Arial" w:cs="Arial"/>
+          <w:color w:val="000000" w:themeColor="text1"/>
+        </w:rPr>
+        <w:t xml:space="preserve"> Gustavo </w:t>
+      </w:r>
+      <w:proofErr w:type="spellStart"/>
+      <w:r>
+        <w:rPr>
+          <w:rFonts w:ascii="Arial" w:hAnsi="Arial" w:cs="Arial"/>
+          <w:color w:val="000000" w:themeColor="text1"/>
+        </w:rPr>
+        <w:t>Genovez</w:t>
+      </w:r>
+      <w:proofErr w:type="spellEnd"/>
+      <w:r>
+        <w:rPr>
+          <w:rFonts w:ascii="Arial" w:hAnsi="Arial" w:cs="Arial"/>
+          <w:color w:val="000000" w:themeColor="text1"/>
+        </w:rPr>
+        <w:t xml:space="preserve"> De </w:t>
+      </w:r>
+      <w:r>
+        <w:rPr>
+          <w:rFonts w:ascii="Arial" w:hAnsi="Arial" w:cs="Arial"/>
+          <w:color w:val="000000" w:themeColor="text1"/>
+          <w:spacing w:val="-2"/>
+        </w:rPr>
+        <w:t>Oliveira</w:t>
+      </w:r>
+      <w:r>
+        <w:rPr>
+          <w:rFonts w:ascii="Arial" w:hAnsi="Arial" w:cs="Arial"/>
           <w:b/>
           <w:bCs/>
-          <w:color w:val="000000"/>
-        </w:rPr>
-        <w:t>Lins-SP 2026</w:t>
-      </w:r>
-    </w:p>
-    <w:p>
-      <w:pPr>
-        <w:pBdr>
-          <w:top w:val="nil"/>
-          <w:left w:val="nil"/>
-          <w:bottom w:val="nil"/>
-          <w:right w:val="nil"/>
-          <w:between w:val="nil"/>
-        </w:pBdr>
-        <w:spacing w:after="140" w:line="276" w:lineRule="auto"/>
-        <w:rPr>
-          <w:rFonts w:ascii="Arial" w:eastAsia="Arial" w:hAnsi="Arial" w:cs="Arial"/>
-          <w:color w:val="000000"/>
-        </w:rPr>
-      </w:pPr>
-    </w:p>
-    <w:p>
-      <w:pPr>
-        <w:pBdr>
-          <w:top w:val="nil"/>
-          <w:left w:val="nil"/>
-          <w:bottom w:val="nil"/>
-          <w:right w:val="nil"/>
-          <w:between w:val="nil"/>
-        </w:pBdr>
-        <w:spacing w:after="140" w:line="276" w:lineRule="auto"/>
+        </w:rPr>
+        <w:tab/>
+      </w:r>
+    </w:p>
+    <w:p>
+      <w:pPr>
+        <w:tabs>
+          <w:tab w:val="left" w:pos="3171"/>
+        </w:tabs>
         <w:jc w:val="center"/>
         <w:rPr>
-          <w:rFonts w:ascii="Arial" w:eastAsia="Arial" w:hAnsi="Arial" w:cs="Arial"/>
-          <w:color w:val="000000"/>
-        </w:rPr>
-      </w:pPr>
-      <w:r>
-        <w:rPr>
-          <w:rFonts w:ascii="Arial" w:eastAsia="Arial" w:hAnsi="Arial" w:cs="Arial"/>
-          <w:color w:val="000000"/>
-        </w:rPr>
-        <w:t xml:space="preserve">          Anderson Clayton Pereira de Assis</w:t>
-      </w:r>
-    </w:p>
-    <w:p>
-      <w:pPr>
-        <w:pBdr>
-          <w:top w:val="nil"/>
-          <w:left w:val="nil"/>
-          <w:bottom w:val="nil"/>
-          <w:right w:val="nil"/>
-          <w:between w:val="nil"/>
-        </w:pBdr>
-        <w:spacing w:after="140" w:line="276" w:lineRule="auto"/>
-        <w:jc w:val="center"/>
-        <w:rPr>
-          <w:rFonts w:ascii="Arial" w:eastAsia="Arial" w:hAnsi="Arial" w:cs="Arial"/>
-          <w:color w:val="000000"/>
-        </w:rPr>
-      </w:pPr>
-      <w:r>
-        <w:rPr>
-          <w:rFonts w:ascii="Arial" w:eastAsia="Arial" w:hAnsi="Arial" w:cs="Arial"/>
-          <w:color w:val="000000"/>
-        </w:rPr>
-        <w:t xml:space="preserve">        Anderson Porto Abrantes</w:t>
-      </w:r>
-    </w:p>
-    <w:p>
-      <w:pPr>
-        <w:pBdr>
-          <w:top w:val="nil"/>
-          <w:left w:val="nil"/>
-          <w:bottom w:val="nil"/>
-          <w:right w:val="nil"/>
-          <w:between w:val="nil"/>
-        </w:pBdr>
-        <w:spacing w:after="140" w:line="276" w:lineRule="auto"/>
-        <w:jc w:val="center"/>
-        <w:rPr>
-          <w:rFonts w:ascii="Arial" w:eastAsia="Arial" w:hAnsi="Arial" w:cs="Arial"/>
-          <w:color w:val="000000"/>
-        </w:rPr>
-      </w:pPr>
-      <w:r>
-        <w:rPr>
-          <w:rFonts w:ascii="Arial" w:eastAsia="Arial" w:hAnsi="Arial" w:cs="Arial"/>
-          <w:color w:val="000000"/>
-        </w:rPr>
-        <w:t xml:space="preserve">      Eduardo Matias Ferreira</w:t>
-      </w:r>
-    </w:p>
-    <w:p>
-      <w:pPr>
-        <w:pBdr>
-          <w:top w:val="nil"/>
-          <w:left w:val="nil"/>
-          <w:bottom w:val="nil"/>
-          <w:right w:val="nil"/>
-          <w:between w:val="nil"/>
-        </w:pBdr>
-        <w:spacing w:after="140" w:line="276" w:lineRule="auto"/>
-        <w:jc w:val="center"/>
-        <w:rPr>
-          <w:rFonts w:ascii="Arial" w:eastAsia="Arial" w:hAnsi="Arial" w:cs="Arial"/>
-          <w:color w:val="000000"/>
-        </w:rPr>
-      </w:pPr>
-      <w:r>
-        <w:rPr>
-          <w:rFonts w:ascii="Arial" w:eastAsia="Arial" w:hAnsi="Arial" w:cs="Arial"/>
-          <w:color w:val="000000"/>
-        </w:rPr>
-        <w:t xml:space="preserve">        Poliana da Silva Benedito</w:t>
-      </w:r>
-    </w:p>
-    <w:p>
-      <w:pPr>
-        <w:pBdr>
-          <w:top w:val="nil"/>
-          <w:left w:val="nil"/>
-          <w:bottom w:val="nil"/>
-          <w:right w:val="nil"/>
-          <w:between w:val="nil"/>
-        </w:pBdr>
-        <w:spacing w:after="140" w:line="276" w:lineRule="auto"/>
-        <w:rPr>
-          <w:rFonts w:ascii="Arial" w:eastAsia="Arial" w:hAnsi="Arial" w:cs="Arial"/>
-          <w:color w:val="000000"/>
-        </w:rPr>
-      </w:pPr>
-    </w:p>
-    <w:p>
-      <w:pPr>
-        <w:pBdr>
-          <w:top w:val="nil"/>
-          <w:left w:val="nil"/>
-          <w:bottom w:val="nil"/>
-          <w:right w:val="nil"/>
-          <w:between w:val="nil"/>
-        </w:pBdr>
-        <w:spacing w:after="140" w:line="276" w:lineRule="auto"/>
-        <w:rPr>
-          <w:rFonts w:ascii="Arial" w:eastAsia="Arial" w:hAnsi="Arial" w:cs="Arial"/>
-          <w:color w:val="000000"/>
-        </w:rPr>
-      </w:pPr>
-    </w:p>
-    <w:p>
-      <w:pPr>
-        <w:pBdr>
-          <w:top w:val="nil"/>
-          <w:left w:val="nil"/>
-          <w:bottom w:val="nil"/>
-          <w:right w:val="nil"/>
-          <w:between w:val="nil"/>
-        </w:pBdr>
-        <w:spacing w:after="140" w:line="276" w:lineRule="auto"/>
-        <w:rPr>
-          <w:rFonts w:ascii="Arial" w:eastAsia="Arial" w:hAnsi="Arial" w:cs="Arial"/>
-          <w:color w:val="000000"/>
-        </w:rPr>
-      </w:pPr>
-    </w:p>
-    <w:p>
-      <w:pPr>
-        <w:pBdr>
-          <w:top w:val="nil"/>
-          <w:left w:val="nil"/>
-          <w:bottom w:val="nil"/>
-          <w:right w:val="nil"/>
-          <w:between w:val="nil"/>
-        </w:pBdr>
-        <w:spacing w:after="140" w:line="276" w:lineRule="auto"/>
-        <w:rPr>
-          <w:rFonts w:ascii="Arial" w:eastAsia="Arial" w:hAnsi="Arial" w:cs="Arial"/>
-          <w:color w:val="000000"/>
-        </w:rPr>
-      </w:pPr>
-    </w:p>
-    <w:p>
-      <w:pPr>
-        <w:pStyle w:val="Ttulo3"/>
-        <w:ind w:left="565" w:right="4" w:firstLine="0"/>
-        <w:jc w:val="center"/>
-      </w:pPr>
-      <w:r>
-        <w:t>ESTUDO DE CASO</w:t>
-      </w:r>
-    </w:p>
-    <w:p>
-      <w:pPr>
-        <w:pBdr>
-          <w:top w:val="nil"/>
-          <w:left w:val="nil"/>
-          <w:bottom w:val="nil"/>
-          <w:right w:val="nil"/>
-          <w:between w:val="nil"/>
-        </w:pBdr>
-        <w:spacing w:before="272" w:line="276" w:lineRule="auto"/>
-        <w:ind w:left="565" w:right="5"/>
-        <w:jc w:val="center"/>
-        <w:rPr>
-          <w:rFonts w:ascii="Arial" w:eastAsia="Arial" w:hAnsi="Arial" w:cs="Arial"/>
-          <w:color w:val="000000"/>
-        </w:rPr>
-      </w:pPr>
-      <w:r>
-        <w:rPr>
-          <w:rFonts w:ascii="Arial" w:eastAsia="Arial" w:hAnsi="Arial" w:cs="Arial"/>
-          <w:color w:val="000000"/>
-        </w:rPr>
-        <w:t xml:space="preserve">   Levantamento e Análise de Requisitos</w:t>
-      </w:r>
-    </w:p>
-    <w:p>
-      <w:pPr>
-        <w:pBdr>
-          <w:top w:val="nil"/>
-          <w:left w:val="nil"/>
-          <w:bottom w:val="nil"/>
-          <w:right w:val="nil"/>
-          <w:between w:val="nil"/>
-        </w:pBdr>
-        <w:spacing w:after="140" w:line="276" w:lineRule="auto"/>
-        <w:rPr>
-          <w:rFonts w:ascii="Arial" w:eastAsia="Arial" w:hAnsi="Arial" w:cs="Arial"/>
-          <w:color w:val="000000"/>
-        </w:rPr>
-      </w:pPr>
-    </w:p>
-    <w:p>
-      <w:pPr>
-        <w:pBdr>
-          <w:top w:val="nil"/>
-          <w:left w:val="nil"/>
-          <w:bottom w:val="nil"/>
-          <w:right w:val="nil"/>
-          <w:between w:val="nil"/>
-        </w:pBdr>
-        <w:spacing w:after="140" w:line="276" w:lineRule="auto"/>
-        <w:rPr>
-          <w:rFonts w:ascii="Arial" w:eastAsia="Arial" w:hAnsi="Arial" w:cs="Arial"/>
-          <w:color w:val="000000"/>
-        </w:rPr>
-      </w:pPr>
-    </w:p>
-    <w:p>
-      <w:pPr>
-        <w:pBdr>
-          <w:top w:val="nil"/>
-          <w:left w:val="nil"/>
-          <w:bottom w:val="nil"/>
-          <w:right w:val="nil"/>
-          <w:between w:val="nil"/>
-        </w:pBdr>
-        <w:spacing w:after="140" w:line="276" w:lineRule="auto"/>
-        <w:rPr>
-          <w:rFonts w:ascii="Arial" w:eastAsia="Arial" w:hAnsi="Arial" w:cs="Arial"/>
-          <w:color w:val="000000"/>
-        </w:rPr>
-      </w:pPr>
-    </w:p>
-    <w:p>
-      <w:pPr>
-        <w:pBdr>
-          <w:top w:val="nil"/>
-          <w:left w:val="nil"/>
-          <w:bottom w:val="nil"/>
-          <w:right w:val="nil"/>
-          <w:between w:val="nil"/>
-        </w:pBdr>
-        <w:spacing w:after="140" w:line="276" w:lineRule="auto"/>
-        <w:rPr>
-          <w:rFonts w:ascii="Arial" w:eastAsia="Arial" w:hAnsi="Arial" w:cs="Arial"/>
-          <w:color w:val="000000"/>
-        </w:rPr>
-      </w:pPr>
-    </w:p>
-    <w:p>
-      <w:pPr>
-        <w:pBdr>
-          <w:top w:val="nil"/>
-          <w:left w:val="nil"/>
-          <w:bottom w:val="nil"/>
-          <w:right w:val="nil"/>
-          <w:between w:val="nil"/>
-        </w:pBdr>
-        <w:spacing w:after="140" w:line="480" w:lineRule="auto"/>
-        <w:ind w:left="5673" w:right="425"/>
-        <w:jc w:val="both"/>
-        <w:rPr>
-          <w:rFonts w:ascii="Arial" w:eastAsia="Arial" w:hAnsi="Arial" w:cs="Arial"/>
-          <w:color w:val="000000"/>
-        </w:rPr>
-      </w:pPr>
-      <w:r>
-        <w:rPr>
-          <w:rFonts w:ascii="Arial" w:eastAsia="Arial" w:hAnsi="Arial" w:cs="Arial"/>
-          <w:color w:val="000000"/>
-        </w:rPr>
-        <w:t>Estudo de caso apresentado como atividade avaliativa da disciplina de Engenharia de Software do curso superior em Análise e Desenvolvimento de Sistemas do Centro Estadual de Educação Tecnológica Paula Souza.</w:t>
-      </w:r>
-    </w:p>
-    <w:p>
-      <w:pPr>
-        <w:pBdr>
-          <w:top w:val="nil"/>
-          <w:left w:val="nil"/>
-          <w:bottom w:val="nil"/>
-          <w:right w:val="nil"/>
-          <w:between w:val="nil"/>
-        </w:pBdr>
-        <w:spacing w:before="1" w:line="480" w:lineRule="auto"/>
-        <w:ind w:left="5673" w:right="428"/>
-        <w:jc w:val="both"/>
-        <w:rPr>
-          <w:rFonts w:ascii="Arial" w:eastAsia="Arial" w:hAnsi="Arial" w:cs="Arial"/>
-          <w:color w:val="000000"/>
-        </w:rPr>
-      </w:pPr>
-      <w:r>
-        <w:rPr>
-          <w:rFonts w:ascii="Arial" w:eastAsia="Arial" w:hAnsi="Arial" w:cs="Arial"/>
-          <w:color w:val="000000"/>
-        </w:rPr>
-        <w:t>Professor: Alciano Gustavo Genovez De Oliveira</w:t>
-      </w:r>
-    </w:p>
-    <w:p>
-      <w:pPr>
-        <w:pBdr>
-          <w:top w:val="nil"/>
-          <w:left w:val="nil"/>
-          <w:bottom w:val="nil"/>
-          <w:right w:val="nil"/>
-          <w:between w:val="nil"/>
-        </w:pBdr>
-        <w:spacing w:before="1" w:line="480" w:lineRule="auto"/>
-        <w:ind w:left="5673" w:right="428"/>
-        <w:jc w:val="both"/>
-        <w:rPr>
-          <w:rFonts w:ascii="Arial" w:eastAsia="Arial" w:hAnsi="Arial" w:cs="Arial"/>
-          <w:color w:val="000000"/>
-        </w:rPr>
-      </w:pPr>
-    </w:p>
-    <w:p>
-      <w:pPr>
-        <w:pBdr>
-          <w:top w:val="nil"/>
-          <w:left w:val="nil"/>
-          <w:bottom w:val="nil"/>
-          <w:right w:val="nil"/>
-          <w:between w:val="nil"/>
-        </w:pBdr>
-        <w:spacing w:line="480" w:lineRule="auto"/>
-        <w:ind w:right="4373"/>
-        <w:rPr>
-          <w:rFonts w:ascii="Arial" w:eastAsia="Arial" w:hAnsi="Arial" w:cs="Arial"/>
+          <w:rFonts w:ascii="Arial" w:hAnsi="Arial" w:cs="Arial"/>
           <w:b/>
           <w:bCs/>
-          <w:color w:val="000000"/>
-        </w:rPr>
-      </w:pPr>
-    </w:p>
-    <w:p>
-      <w:pPr>
-        <w:pBdr>
-          <w:top w:val="nil"/>
-          <w:left w:val="nil"/>
-          <w:bottom w:val="nil"/>
-          <w:right w:val="nil"/>
-          <w:between w:val="nil"/>
-        </w:pBdr>
-        <w:spacing w:line="480" w:lineRule="auto"/>
-        <w:ind w:right="4373"/>
-        <w:rPr>
-          <w:rFonts w:ascii="Arial" w:eastAsia="Arial" w:hAnsi="Arial" w:cs="Arial"/>
+        </w:rPr>
+      </w:pPr>
+    </w:p>
+    <w:p>
+      <w:pPr>
+        <w:tabs>
+          <w:tab w:val="left" w:pos="3171"/>
+        </w:tabs>
+        <w:jc w:val="center"/>
+        <w:rPr>
+          <w:rFonts w:ascii="Arial" w:hAnsi="Arial" w:cs="Arial"/>
           <w:b/>
           <w:bCs/>
-          <w:color w:val="000000"/>
-        </w:rPr>
-      </w:pPr>
-    </w:p>
-    <w:p>
-      <w:pPr>
-        <w:pBdr>
-          <w:top w:val="nil"/>
-          <w:left w:val="nil"/>
-          <w:bottom w:val="nil"/>
-          <w:right w:val="nil"/>
-          <w:between w:val="nil"/>
-        </w:pBdr>
-        <w:spacing w:line="480" w:lineRule="auto"/>
-        <w:ind w:left="4942" w:right="4373"/>
-        <w:jc w:val="center"/>
-        <w:rPr>
-          <w:color w:val="000000"/>
-        </w:rPr>
-        <w:sectPr>
-          <w:footerReference w:type="default" r:id="rId8"/>
-          <w:pgSz w:w="11906" w:h="16838"/>
-          <w:pgMar w:top="1600" w:right="705" w:bottom="280" w:left="708" w:header="720" w:footer="720" w:gutter="0"/>
-          <w:cols w:space="720"/>
-        </w:sectPr>
-      </w:pPr>
-      <w:r>
-        <w:rPr>
-          <w:rFonts w:ascii="Arial" w:eastAsia="Arial" w:hAnsi="Arial" w:cs="Arial"/>
+        </w:rPr>
+      </w:pPr>
+    </w:p>
+    <w:p>
+      <w:pPr>
+        <w:tabs>
+          <w:tab w:val="left" w:pos="3096"/>
+        </w:tabs>
+        <w:rPr>
+          <w:rFonts w:ascii="Arial" w:hAnsi="Arial" w:cs="Arial"/>
           <w:b/>
           <w:bCs/>
-          <w:color w:val="000000"/>
-        </w:rPr>
-        <w:t>Lins-SP 2026</w:t>
+        </w:rPr>
+      </w:pPr>
+    </w:p>
+    <w:p>
+      <w:pPr>
+        <w:rPr>
+          <w:rFonts w:ascii="Arial" w:hAnsi="Arial" w:cs="Arial"/>
+          <w:b/>
+          <w:bCs/>
+        </w:rPr>
+      </w:pPr>
+      <w:bookmarkStart w:id="10" w:name="_GoBack"/>
+      <w:bookmarkEnd w:id="10"/>
+    </w:p>
+    <w:p>
+      <w:pPr>
+        <w:jc w:val="center"/>
+        <w:rPr>
+          <w:rFonts w:ascii="Arial" w:hAnsi="Arial" w:cs="Arial"/>
+          <w:b/>
+          <w:bCs/>
+        </w:rPr>
+      </w:pPr>
+    </w:p>
+    <w:p>
+      <w:pPr>
+        <w:jc w:val="center"/>
+        <w:rPr>
+          <w:rFonts w:ascii="Arial" w:hAnsi="Arial" w:cs="Arial"/>
+        </w:rPr>
+      </w:pPr>
+      <w:r>
+        <w:rPr>
+          <w:rFonts w:ascii="Arial" w:hAnsi="Arial" w:cs="Arial"/>
+          <w:b/>
+          <w:bCs/>
+        </w:rPr>
+        <w:t>LINS/SP</w:t>
+      </w:r>
+    </w:p>
+    <w:p>
+      <w:pPr>
+        <w:jc w:val="center"/>
+        <w:rPr>
+          <w:rFonts w:ascii="Arial" w:hAnsi="Arial" w:cs="Arial"/>
+          <w:b/>
+          <w:bCs/>
+        </w:rPr>
+      </w:pPr>
+      <w:r>
+        <w:rPr>
+          <w:rFonts w:ascii="Arial" w:hAnsi="Arial" w:cs="Arial"/>
+          <w:b/>
+          <w:bCs/>
+        </w:rPr>
+        <w:t>1º SEMESTRE/2026</w:t>
       </w:r>
     </w:p>
     <w:p>
@@ -1109,14 +1341,7 @@
           <w:rFonts w:ascii="Arial" w:eastAsia="Arial" w:hAnsi="Arial" w:cs="Arial"/>
           <w:color w:val="000000"/>
         </w:rPr>
-        <w:t>O projeto tem como objetivo proporcionar aos estudantes uma experiência prática de desenvolvimento de software, envolvendo análise de requisitos, modelagem de dados, desenvolvimento de aplicações web, usabilidade, segurança da informação e geração de relat</w:t>
-      </w:r>
-      <w:r>
-        <w:rPr>
-          <w:rFonts w:ascii="Arial" w:eastAsia="Arial" w:hAnsi="Arial" w:cs="Arial"/>
-          <w:color w:val="000000"/>
-        </w:rPr>
-        <w:t>órios analíticos.</w:t>
+        <w:t>O projeto tem como objetivo proporcionar aos estudantes uma experiência prática de desenvolvimento de software, envolvendo análise de requisitos, modelagem de dados, desenvolvimento de aplicações web, usabilidade, segurança da informação e geração de relatórios analíticos.</w:t>
       </w:r>
     </w:p>
     <w:p>
@@ -1654,6 +1879,7 @@
         <w:ind w:left="12" w:firstLine="0"/>
       </w:pPr>
       <w:r>
+        <w:lastRenderedPageBreak/>
         <w:t>Cadastro de pesquisas</w:t>
       </w:r>
     </w:p>
@@ -1725,7 +1951,6 @@
           <w:rFonts w:ascii="Arial" w:eastAsia="Arial" w:hAnsi="Arial" w:cs="Arial"/>
           <w:color w:val="000000"/>
         </w:rPr>
-        <w:lastRenderedPageBreak/>
         <w:t>título da pesquisa</w:t>
       </w:r>
     </w:p>
@@ -2445,14 +2670,7 @@
           <w:rFonts w:ascii="Arial" w:eastAsia="Arial" w:hAnsi="Arial" w:cs="Arial"/>
           <w:color w:val="000000"/>
         </w:rPr>
-        <w:t xml:space="preserve">Cada categoria poderá </w:t>
-      </w:r>
-      <w:r>
-        <w:rPr>
-          <w:rFonts w:ascii="Arial" w:eastAsia="Arial" w:hAnsi="Arial" w:cs="Arial"/>
-          <w:color w:val="000000"/>
-        </w:rPr>
-        <w:t>possuir seu próprio questionário.</w:t>
+        <w:t>Cada categoria poderá possuir seu próprio questionário.</w:t>
       </w:r>
     </w:p>
     <w:p>
@@ -2565,6 +2783,7 @@
           <w:rFonts w:ascii="Arial" w:eastAsia="Arial" w:hAnsi="Arial" w:cs="Arial"/>
           <w:color w:val="000000"/>
         </w:rPr>
+        <w:lastRenderedPageBreak/>
         <w:t>Características:</w:t>
       </w:r>
     </w:p>
@@ -2698,7 +2917,6 @@
           <w:rFonts w:ascii="Arial" w:eastAsia="Arial" w:hAnsi="Arial" w:cs="Arial"/>
           <w:color w:val="000000"/>
         </w:rPr>
-        <w:lastRenderedPageBreak/>
         <w:t>Cada senha deve permitir apenas uma resposta Funcionalidades:</w:t>
       </w:r>
     </w:p>
@@ -4315,6 +4533,7 @@
           <w:rFonts w:ascii="Arial" w:eastAsia="Arial" w:hAnsi="Arial" w:cs="Arial"/>
           <w:color w:val="000000"/>
         </w:rPr>
+        <w:lastRenderedPageBreak/>
         <w:t>Validação de acesso</w:t>
       </w:r>
     </w:p>
@@ -4629,7 +4848,6 @@
                 <w:rFonts w:ascii="Arial" w:eastAsia="Arial" w:hAnsi="Arial" w:cs="Arial"/>
                 <w:color w:val="000000"/>
               </w:rPr>
-              <w:lastRenderedPageBreak/>
               <w:t>Backend:</w:t>
             </w:r>
           </w:p>
@@ -5125,9 +5343,11 @@
           <w:color w:val="000000"/>
         </w:rPr>
         <w:sectPr>
+          <w:footerReference w:type="default" r:id="rId8"/>
           <w:pgSz w:w="11906" w:h="16838"/>
-          <w:pgMar w:top="620" w:right="708" w:bottom="280" w:left="708" w:header="720" w:footer="720" w:gutter="0"/>
+          <w:pgMar w:top="1701" w:right="1134" w:bottom="1134" w:left="1701" w:header="720" w:footer="720" w:gutter="0"/>
           <w:cols w:space="720"/>
+          <w:docGrid w:linePitch="326"/>
         </w:sectPr>
       </w:pPr>
       <w:r>
@@ -8230,8 +8450,6 @@
         <w:lastRenderedPageBreak/>
         <w:t xml:space="preserve">          </w:t>
       </w:r>
-      <w:bookmarkStart w:id="16" w:name="_GoBack"/>
-      <w:bookmarkEnd w:id="16"/>
       <w:r>
         <w:t>User Stories</w:t>
       </w:r>
@@ -12288,16 +12506,7 @@
           <w:sz w:val="22"/>
           <w:szCs w:val="22"/>
         </w:rPr>
-        <w:t>O Administrador clica e</w:t>
-      </w:r>
-      <w:r>
-        <w:rPr>
-          <w:rFonts w:ascii="Arial" w:eastAsia="Arial" w:hAnsi="Arial" w:cs="Arial"/>
-          <w:color w:val="000000"/>
-          <w:sz w:val="22"/>
-          <w:szCs w:val="22"/>
-        </w:rPr>
-        <w:t>m "Salvar".</w:t>
+        <w:t>O Administrador clica em "Salvar".</w:t>
       </w:r>
     </w:p>
     <w:p>
@@ -12426,16 +12635,7 @@
           <w:sz w:val="22"/>
           <w:szCs w:val="22"/>
         </w:rPr>
-        <w:t>O sistema exibe uma mensagem de suce</w:t>
-      </w:r>
-      <w:r>
-        <w:rPr>
-          <w:rFonts w:ascii="Arial" w:eastAsia="Arial" w:hAnsi="Arial" w:cs="Arial"/>
-          <w:color w:val="000000"/>
-          <w:sz w:val="22"/>
-          <w:szCs w:val="22"/>
-        </w:rPr>
-        <w:t>sso na tela.</w:t>
+        <w:t>O sistema exibe uma mensagem de sucesso na tela.</w:t>
       </w:r>
     </w:p>
     <w:p>
@@ -12680,17 +12880,7 @@
           <w:sz w:val="22"/>
           <w:szCs w:val="22"/>
         </w:rPr>
-        <w:t>Caso de Uso: Cadastrar Categorias de Pa</w:t>
-      </w:r>
-      <w:r>
-        <w:rPr>
-          <w:rFonts w:ascii="Arial" w:eastAsia="Arial" w:hAnsi="Arial" w:cs="Arial"/>
-          <w:b/>
-          <w:bCs/>
-          <w:sz w:val="22"/>
-          <w:szCs w:val="22"/>
-        </w:rPr>
-        <w:t>rticipantes (US-ADM-02)</w:t>
+        <w:t>Caso de Uso: Cadastrar Categorias de Participantes (US-ADM-02)</w:t>
       </w:r>
     </w:p>
     <w:p>
@@ -13066,16 +13256,7 @@
           <w:sz w:val="22"/>
           <w:szCs w:val="22"/>
         </w:rPr>
-        <w:t>O sistema bloqu</w:t>
-      </w:r>
-      <w:r>
-        <w:rPr>
-          <w:rFonts w:ascii="Arial" w:eastAsia="Arial" w:hAnsi="Arial" w:cs="Arial"/>
-          <w:color w:val="000000"/>
-          <w:sz w:val="22"/>
-          <w:szCs w:val="22"/>
-        </w:rPr>
-        <w:t>eia a inserção.</w:t>
+        <w:t>O sistema bloqueia a inserção.</w:t>
       </w:r>
     </w:p>
     <w:p>
@@ -13369,16 +13550,7 @@
           <w:sz w:val="22"/>
           <w:szCs w:val="22"/>
         </w:rPr>
-        <w:t xml:space="preserve">O </w:t>
-      </w:r>
-      <w:r>
-        <w:rPr>
-          <w:rFonts w:ascii="Arial" w:eastAsia="Arial" w:hAnsi="Arial" w:cs="Arial"/>
-          <w:color w:val="000000"/>
-          <w:sz w:val="22"/>
-          <w:szCs w:val="22"/>
-        </w:rPr>
-        <w:t>sistema valida o questionário</w:t>
+        <w:t>O sistema valida o questionário</w:t>
       </w:r>
     </w:p>
     <w:p>
@@ -13509,16 +13681,7 @@
           <w:sz w:val="22"/>
           <w:szCs w:val="22"/>
         </w:rPr>
-        <w:t>O sistema realiza</w:t>
-      </w:r>
-      <w:r>
-        <w:rPr>
-          <w:rFonts w:ascii="Arial" w:eastAsia="Arial" w:hAnsi="Arial" w:cs="Arial"/>
-          <w:color w:val="000000"/>
-          <w:sz w:val="22"/>
-          <w:szCs w:val="22"/>
-        </w:rPr>
-        <w:t xml:space="preserve"> a validação e constata que o mínimo de 1 pergunta não foi atingido.</w:t>
+        <w:t>O sistema realiza a validação e constata que o mínimo de 1 pergunta não foi atingido.</w:t>
       </w:r>
     </w:p>
     <w:p>
@@ -13805,16 +13968,7 @@
           <w:sz w:val="22"/>
           <w:szCs w:val="22"/>
         </w:rPr>
-        <w:t>O</w:t>
-      </w:r>
-      <w:r>
-        <w:rPr>
-          <w:rFonts w:ascii="Arial" w:eastAsia="Arial" w:hAnsi="Arial" w:cs="Arial"/>
-          <w:color w:val="000000"/>
-          <w:sz w:val="22"/>
-          <w:szCs w:val="22"/>
-        </w:rPr>
-        <w:t xml:space="preserve"> sistema calcula a assinatura hash (SHA-256) de cada senha gerada (</w:t>
+        <w:t>O sistema calcula a assinatura hash (SHA-256) de cada senha gerada (</w:t>
       </w:r>
       <w:r>
         <w:rPr>
@@ -14348,16 +14502,7 @@
           <w:sz w:val="22"/>
           <w:szCs w:val="22"/>
         </w:rPr>
-        <w:t>No passo 2 do fluxo principal, após a aplicaçã</w:t>
-      </w:r>
-      <w:r>
-        <w:rPr>
-          <w:rFonts w:ascii="Arial" w:eastAsia="Arial" w:hAnsi="Arial" w:cs="Arial"/>
-          <w:color w:val="000000"/>
-          <w:sz w:val="22"/>
-          <w:szCs w:val="22"/>
-        </w:rPr>
-        <w:t>o dos filtros, o sistema realiza a busca mas constata que nenhum participante respondeu à pesquisa naquele período.</w:t>
+        <w:t>No passo 2 do fluxo principal, após a aplicação dos filtros, o sistema realiza a busca mas constata que nenhum participante respondeu à pesquisa naquele período.</w:t>
       </w:r>
     </w:p>
     <w:p>
@@ -14432,18 +14577,7 @@
           <w:sz w:val="22"/>
           <w:szCs w:val="22"/>
         </w:rPr>
-        <w:t>"Nenhuma resposta encontrada para os f</w:t>
-      </w:r>
-      <w:r>
-        <w:rPr>
-          <w:rFonts w:ascii="Arial" w:eastAsia="Arial" w:hAnsi="Arial" w:cs="Arial"/>
-          <w:i/>
-          <w:iCs/>
-          <w:color w:val="000000"/>
-          <w:sz w:val="22"/>
-          <w:szCs w:val="22"/>
-        </w:rPr>
-        <w:t>iltros."</w:t>
+        <w:t>"Nenhuma resposta encontrada para os filtros."</w:t>
       </w:r>
     </w:p>
     <w:p>
@@ -16859,18 +16993,7 @@
           <w:sz w:val="22"/>
           <w:szCs w:val="22"/>
         </w:rPr>
-        <w:t>O sistema valida que a pesquisa correspondente está no período de vi</w:t>
-      </w:r>
-      <w:r>
-        <w:rPr>
-          <w:rFonts w:ascii="Arial" w:eastAsia="Arial" w:hAnsi="Arial" w:cs="Arial"/>
-          <w:i/>
-          <w:iCs/>
-          <w:color w:val="000000"/>
-          <w:sz w:val="22"/>
-          <w:szCs w:val="22"/>
-        </w:rPr>
-        <w:t>gência ativa</w:t>
+        <w:t>O sistema valida que a pesquisa correspondente está no período de vigência ativa</w:t>
       </w:r>
     </w:p>
     <w:p>
@@ -17049,18 +17172,7 @@
           <w:sz w:val="22"/>
           <w:szCs w:val="22"/>
         </w:rPr>
-        <w:t>O sistema bloque</w:t>
-      </w:r>
-      <w:r>
-        <w:rPr>
-          <w:rFonts w:ascii="Arial" w:eastAsia="Arial" w:hAnsi="Arial" w:cs="Arial"/>
-          <w:i/>
-          <w:iCs/>
-          <w:color w:val="000000"/>
-          <w:sz w:val="22"/>
-          <w:szCs w:val="22"/>
-        </w:rPr>
-        <w:t>ia a exibição do questionário (</w:t>
+        <w:t>O sistema bloqueia a exibição do questionário (</w:t>
       </w:r>
       <w:r>
         <w:rPr>
@@ -17230,18 +17342,7 @@
           <w:sz w:val="22"/>
           <w:szCs w:val="22"/>
         </w:rPr>
-        <w:t>O Participante responde sequencialmente às perguntas exibidas em uma int</w:t>
-      </w:r>
-      <w:r>
-        <w:rPr>
-          <w:rFonts w:ascii="Arial" w:eastAsia="Arial" w:hAnsi="Arial" w:cs="Arial"/>
-          <w:i/>
-          <w:iCs/>
-          <w:color w:val="000000"/>
-          <w:sz w:val="22"/>
-          <w:szCs w:val="22"/>
-        </w:rPr>
-        <w:t>erface responsiva/móvel.</w:t>
+        <w:t>O Participante responde sequencialmente às perguntas exibidas em uma interface responsiva/móvel.</w:t>
       </w:r>
     </w:p>
     <w:p>
@@ -17457,18 +17558,7 @@
           <w:sz w:val="22"/>
           <w:szCs w:val="22"/>
         </w:rPr>
-        <w:t xml:space="preserve">O sistema altera o status da senha usada para "Utilizada" no banco </w:t>
-      </w:r>
-      <w:r>
-        <w:rPr>
-          <w:rFonts w:ascii="Arial" w:eastAsia="Arial" w:hAnsi="Arial" w:cs="Arial"/>
-          <w:i/>
-          <w:iCs/>
-          <w:color w:val="000000"/>
-          <w:sz w:val="22"/>
-          <w:szCs w:val="22"/>
-        </w:rPr>
-        <w:t>de dados para impedir fraudes.</w:t>
+        <w:t>O sistema altera o status da senha usada para "Utilizada" no banco de dados para impedir fraudes.</w:t>
       </w:r>
     </w:p>
     <w:p>
@@ -17576,18 +17666,7 @@
           <w:sz w:val="22"/>
           <w:szCs w:val="22"/>
         </w:rPr>
-        <w:t>No passo 3 do fluxo principal, o Participante tenta submeter o questionário final deixando uma ou mais perg</w:t>
-      </w:r>
-      <w:r>
-        <w:rPr>
-          <w:rFonts w:ascii="Arial" w:eastAsia="Arial" w:hAnsi="Arial" w:cs="Arial"/>
-          <w:i/>
-          <w:iCs/>
-          <w:color w:val="000000"/>
-          <w:sz w:val="22"/>
-          <w:szCs w:val="22"/>
-        </w:rPr>
-        <w:t>untas obrigatórias sem preenchimento.</w:t>
+        <w:t>No passo 3 do fluxo principal, o Participante tenta submeter o questionário final deixando uma ou mais perguntas obrigatórias sem preenchimento.</w:t>
       </w:r>
     </w:p>
     <w:p>
@@ -17695,18 +17774,7 @@
           <w:sz w:val="22"/>
           <w:szCs w:val="22"/>
         </w:rPr>
-        <w:t>O sistema rola a tela até a pergunta pendente, destaca-a visualmente e exibe o ale</w:t>
-      </w:r>
-      <w:r>
-        <w:rPr>
-          <w:rFonts w:ascii="Arial" w:eastAsia="Arial" w:hAnsi="Arial" w:cs="Arial"/>
-          <w:i/>
-          <w:iCs/>
-          <w:color w:val="000000"/>
-          <w:sz w:val="22"/>
-          <w:szCs w:val="22"/>
-        </w:rPr>
-        <w:t>rta: "Responda todas as perguntas obrigatórias."</w:t>
+        <w:t>O sistema rola a tela até a pergunta pendente, destaca-a visualmente e exibe o alerta: "Responda todas as perguntas obrigatórias."</w:t>
       </w:r>
     </w:p>
     <w:p>
@@ -18036,14 +18104,7 @@
           <w:rFonts w:ascii="Arial" w:eastAsia="Arial" w:hAnsi="Arial" w:cs="Arial"/>
           <w:color w:val="000000"/>
         </w:rPr>
-        <w:t xml:space="preserve"> → "Est</w:t>
-      </w:r>
-      <w:r>
-        <w:rPr>
-          <w:rFonts w:ascii="Arial" w:eastAsia="Arial" w:hAnsi="Arial" w:cs="Arial"/>
-          <w:color w:val="000000"/>
-        </w:rPr>
-        <w:t>a senha já foi utilizada."</w:t>
+        <w:t xml:space="preserve"> → "Esta senha já foi utilizada."</w:t>
       </w:r>
     </w:p>
     <w:p>
@@ -19008,18 +19069,7 @@
           <w:sz w:val="22"/>
           <w:szCs w:val="22"/>
         </w:rPr>
-        <w:t xml:space="preserve">O usuário clica na </w:t>
-      </w:r>
-      <w:r>
-        <w:rPr>
-          <w:rFonts w:ascii="Arial" w:eastAsia="Arial" w:hAnsi="Arial" w:cs="Arial"/>
-          <w:i/>
-          <w:iCs/>
-          <w:color w:val="000000"/>
-          <w:sz w:val="22"/>
-          <w:szCs w:val="22"/>
-        </w:rPr>
-        <w:t>opção "Aprovar Pesquisa".</w:t>
+        <w:t>O usuário clica na opção "Aprovar Pesquisa".</w:t>
       </w:r>
     </w:p>
     <w:p>
@@ -19126,9 +19176,241 @@
           <w:sz w:val="22"/>
           <w:szCs w:val="22"/>
         </w:rPr>
-        <w:t>Fluxo Alternativo (Reprovação</w:t>
-      </w:r>
-      <w:r>
+        <w:t>Fluxo Alternativo (Reprovação com Justificativa Obrigatória):</w:t>
+      </w:r>
+    </w:p>
+    <w:p>
+      <w:pPr>
+        <w:numPr>
+          <w:ilvl w:val="1"/>
+          <w:numId w:val="15"/>
+        </w:numPr>
+        <w:pBdr>
+          <w:top w:val="nil"/>
+          <w:left w:val="nil"/>
+          <w:bottom w:val="nil"/>
+          <w:right w:val="nil"/>
+          <w:between w:val="nil"/>
+        </w:pBdr>
+        <w:spacing w:before="97" w:after="283" w:line="276" w:lineRule="auto"/>
+        <w:ind w:hanging="283"/>
+        <w:rPr>
+          <w:rFonts w:ascii="Arial" w:eastAsia="Arial" w:hAnsi="Arial" w:cs="Arial"/>
+          <w:i/>
+          <w:iCs/>
+          <w:color w:val="000000"/>
+          <w:sz w:val="22"/>
+          <w:szCs w:val="22"/>
+        </w:rPr>
+      </w:pPr>
+      <w:r>
+        <w:rPr>
+          <w:rFonts w:ascii="Arial" w:eastAsia="Arial" w:hAnsi="Arial" w:cs="Arial"/>
+          <w:i/>
+          <w:iCs/>
+          <w:color w:val="000000"/>
+          <w:sz w:val="22"/>
+          <w:szCs w:val="22"/>
+        </w:rPr>
+        <w:lastRenderedPageBreak/>
+        <w:t>No passo 4 do fluxo principal, o usuário da Secretaria identifica que o questionário fere políticas internas e clica em "Reprovar Pesquisa" (</w:t>
+      </w:r>
+      <w:r>
+        <w:rPr>
+          <w:rFonts w:ascii="Arial" w:eastAsia="Arial" w:hAnsi="Arial" w:cs="Arial"/>
+          <w:color w:val="000000"/>
+        </w:rPr>
+        <w:t>Reprovar com Justificativa</w:t>
+      </w:r>
+      <w:r>
+        <w:rPr>
+          <w:rFonts w:ascii="Arial" w:eastAsia="Arial" w:hAnsi="Arial" w:cs="Arial"/>
+          <w:i/>
+          <w:iCs/>
+          <w:color w:val="000000"/>
+          <w:sz w:val="22"/>
+          <w:szCs w:val="22"/>
+        </w:rPr>
+        <w:t>).</w:t>
+      </w:r>
+    </w:p>
+    <w:p>
+      <w:pPr>
+        <w:numPr>
+          <w:ilvl w:val="1"/>
+          <w:numId w:val="15"/>
+        </w:numPr>
+        <w:pBdr>
+          <w:top w:val="nil"/>
+          <w:left w:val="nil"/>
+          <w:bottom w:val="nil"/>
+          <w:right w:val="nil"/>
+          <w:between w:val="nil"/>
+        </w:pBdr>
+        <w:spacing w:before="97" w:after="283" w:line="276" w:lineRule="auto"/>
+        <w:ind w:hanging="283"/>
+        <w:rPr>
+          <w:rFonts w:ascii="Arial" w:eastAsia="Arial" w:hAnsi="Arial" w:cs="Arial"/>
+          <w:i/>
+          <w:iCs/>
+          <w:color w:val="000000"/>
+          <w:sz w:val="22"/>
+          <w:szCs w:val="22"/>
+        </w:rPr>
+      </w:pPr>
+      <w:r>
+        <w:rPr>
+          <w:rFonts w:ascii="Arial" w:eastAsia="Arial" w:hAnsi="Arial" w:cs="Arial"/>
+          <w:i/>
+          <w:iCs/>
+          <w:color w:val="000000"/>
+          <w:sz w:val="22"/>
+          <w:szCs w:val="22"/>
+        </w:rPr>
+        <w:t>O usuário tenta salvar a reprovação sem preencher o campo de texto explicativo.</w:t>
+      </w:r>
+    </w:p>
+    <w:p>
+      <w:pPr>
+        <w:numPr>
+          <w:ilvl w:val="1"/>
+          <w:numId w:val="15"/>
+        </w:numPr>
+        <w:pBdr>
+          <w:top w:val="nil"/>
+          <w:left w:val="nil"/>
+          <w:bottom w:val="nil"/>
+          <w:right w:val="nil"/>
+          <w:between w:val="nil"/>
+        </w:pBdr>
+        <w:spacing w:before="97" w:after="283" w:line="276" w:lineRule="auto"/>
+        <w:ind w:hanging="283"/>
+        <w:rPr>
+          <w:rFonts w:ascii="Arial" w:eastAsia="Arial" w:hAnsi="Arial" w:cs="Arial"/>
+          <w:i/>
+          <w:iCs/>
+          <w:color w:val="000000"/>
+          <w:sz w:val="22"/>
+          <w:szCs w:val="22"/>
+        </w:rPr>
+      </w:pPr>
+      <w:r>
+        <w:rPr>
+          <w:rFonts w:ascii="Arial" w:eastAsia="Arial" w:hAnsi="Arial" w:cs="Arial"/>
+          <w:i/>
+          <w:iCs/>
+          <w:color w:val="000000"/>
+          <w:sz w:val="22"/>
+          <w:szCs w:val="22"/>
+        </w:rPr>
+        <w:t>O sistema interrompe a gravação e valida que a justificativa exige ao menos 10 caracteres.</w:t>
+      </w:r>
+    </w:p>
+    <w:p>
+      <w:pPr>
+        <w:numPr>
+          <w:ilvl w:val="1"/>
+          <w:numId w:val="15"/>
+        </w:numPr>
+        <w:pBdr>
+          <w:top w:val="nil"/>
+          <w:left w:val="nil"/>
+          <w:bottom w:val="nil"/>
+          <w:right w:val="nil"/>
+          <w:between w:val="nil"/>
+        </w:pBdr>
+        <w:spacing w:before="97" w:after="283" w:line="276" w:lineRule="auto"/>
+        <w:ind w:hanging="283"/>
+        <w:rPr>
+          <w:rFonts w:ascii="Arial" w:eastAsia="Arial" w:hAnsi="Arial" w:cs="Arial"/>
+          <w:i/>
+          <w:iCs/>
+          <w:color w:val="000000"/>
+          <w:sz w:val="22"/>
+          <w:szCs w:val="22"/>
+        </w:rPr>
+      </w:pPr>
+      <w:r>
+        <w:rPr>
+          <w:rFonts w:ascii="Arial" w:eastAsia="Arial" w:hAnsi="Arial" w:cs="Arial"/>
+          <w:i/>
+          <w:iCs/>
+          <w:color w:val="000000"/>
+          <w:sz w:val="22"/>
+          <w:szCs w:val="22"/>
+        </w:rPr>
+        <w:t>O sistema emite o alerta: "Informe o motivo da reprovação."</w:t>
+      </w:r>
+    </w:p>
+    <w:p>
+      <w:pPr>
+        <w:numPr>
+          <w:ilvl w:val="1"/>
+          <w:numId w:val="15"/>
+        </w:numPr>
+        <w:pBdr>
+          <w:top w:val="nil"/>
+          <w:left w:val="nil"/>
+          <w:bottom w:val="nil"/>
+          <w:right w:val="nil"/>
+          <w:between w:val="nil"/>
+        </w:pBdr>
+        <w:spacing w:before="97" w:after="283" w:line="276" w:lineRule="auto"/>
+        <w:ind w:hanging="283"/>
+        <w:rPr>
+          <w:rFonts w:ascii="Arial" w:eastAsia="Arial" w:hAnsi="Arial" w:cs="Arial"/>
+          <w:i/>
+          <w:iCs/>
+          <w:color w:val="000000"/>
+          <w:sz w:val="22"/>
+          <w:szCs w:val="22"/>
+        </w:rPr>
+      </w:pPr>
+      <w:r>
+        <w:rPr>
+          <w:rFonts w:ascii="Arial" w:eastAsia="Arial" w:hAnsi="Arial" w:cs="Arial"/>
+          <w:i/>
+          <w:iCs/>
+          <w:color w:val="000000"/>
+          <w:sz w:val="22"/>
+          <w:szCs w:val="22"/>
+        </w:rPr>
+        <w:t>O status da pesquisa é preservado em análise até o preenchimento válido da justificativa.</w:t>
+      </w:r>
+    </w:p>
+    <w:p>
+      <w:pPr>
+        <w:pStyle w:val="Ttulo4"/>
+        <w:spacing w:before="97" w:after="283" w:line="276" w:lineRule="auto"/>
+        <w:rPr>
+          <w:rFonts w:ascii="Arial" w:eastAsia="Arial" w:hAnsi="Arial" w:cs="Arial"/>
+          <w:i/>
+          <w:iCs/>
+          <w:sz w:val="22"/>
+          <w:szCs w:val="22"/>
+        </w:rPr>
+      </w:pPr>
+      <w:r>
+        <w:rPr>
+          <w:rFonts w:ascii="Arial" w:eastAsia="Arial" w:hAnsi="Arial" w:cs="Arial"/>
+          <w:i/>
+          <w:iCs/>
+          <w:sz w:val="22"/>
+          <w:szCs w:val="22"/>
+        </w:rPr>
+        <w:t>Caso de Uso: Analisar Relatórios Institucionais</w:t>
+      </w:r>
+    </w:p>
+    <w:p>
+      <w:pPr>
+        <w:pBdr>
+          <w:top w:val="nil"/>
+          <w:left w:val="nil"/>
+          <w:bottom w:val="nil"/>
+          <w:right w:val="nil"/>
+          <w:between w:val="nil"/>
+        </w:pBdr>
+        <w:spacing w:before="97" w:after="283" w:line="276" w:lineRule="auto"/>
         <w:rPr>
           <w:rFonts w:ascii="Arial" w:eastAsia="Arial" w:hAnsi="Arial" w:cs="Arial"/>
           <w:b/>
@@ -19139,252 +19421,8 @@
           <w:sz w:val="22"/>
           <w:szCs w:val="22"/>
         </w:rPr>
-        <w:t xml:space="preserve"> com Justificativa Obrigatória):</w:t>
-      </w:r>
-    </w:p>
-    <w:p>
-      <w:pPr>
-        <w:numPr>
-          <w:ilvl w:val="1"/>
-          <w:numId w:val="15"/>
-        </w:numPr>
-        <w:pBdr>
-          <w:top w:val="nil"/>
-          <w:left w:val="nil"/>
-          <w:bottom w:val="nil"/>
-          <w:right w:val="nil"/>
-          <w:between w:val="nil"/>
-        </w:pBdr>
-        <w:spacing w:before="97" w:after="283" w:line="276" w:lineRule="auto"/>
-        <w:ind w:hanging="283"/>
-        <w:rPr>
-          <w:rFonts w:ascii="Arial" w:eastAsia="Arial" w:hAnsi="Arial" w:cs="Arial"/>
-          <w:i/>
-          <w:iCs/>
-          <w:color w:val="000000"/>
-          <w:sz w:val="22"/>
-          <w:szCs w:val="22"/>
-        </w:rPr>
-      </w:pPr>
-      <w:r>
-        <w:rPr>
-          <w:rFonts w:ascii="Arial" w:eastAsia="Arial" w:hAnsi="Arial" w:cs="Arial"/>
-          <w:i/>
-          <w:iCs/>
-          <w:color w:val="000000"/>
-          <w:sz w:val="22"/>
-          <w:szCs w:val="22"/>
-        </w:rPr>
-        <w:lastRenderedPageBreak/>
-        <w:t>No passo 4 do fluxo principal, o usuário da Secretaria identifica que o questionário fere políticas internas e clica em "Reprovar Pesquisa" (</w:t>
-      </w:r>
-      <w:r>
-        <w:rPr>
-          <w:rFonts w:ascii="Arial" w:eastAsia="Arial" w:hAnsi="Arial" w:cs="Arial"/>
-          <w:color w:val="000000"/>
-        </w:rPr>
-        <w:t>Reprovar com Justificativa</w:t>
-      </w:r>
-      <w:r>
-        <w:rPr>
-          <w:rFonts w:ascii="Arial" w:eastAsia="Arial" w:hAnsi="Arial" w:cs="Arial"/>
-          <w:i/>
-          <w:iCs/>
-          <w:color w:val="000000"/>
-          <w:sz w:val="22"/>
-          <w:szCs w:val="22"/>
-        </w:rPr>
-        <w:t>).</w:t>
-      </w:r>
-    </w:p>
-    <w:p>
-      <w:pPr>
-        <w:numPr>
-          <w:ilvl w:val="1"/>
-          <w:numId w:val="15"/>
-        </w:numPr>
-        <w:pBdr>
-          <w:top w:val="nil"/>
-          <w:left w:val="nil"/>
-          <w:bottom w:val="nil"/>
-          <w:right w:val="nil"/>
-          <w:between w:val="nil"/>
-        </w:pBdr>
-        <w:spacing w:before="97" w:after="283" w:line="276" w:lineRule="auto"/>
-        <w:ind w:hanging="283"/>
-        <w:rPr>
-          <w:rFonts w:ascii="Arial" w:eastAsia="Arial" w:hAnsi="Arial" w:cs="Arial"/>
-          <w:i/>
-          <w:iCs/>
-          <w:color w:val="000000"/>
-          <w:sz w:val="22"/>
-          <w:szCs w:val="22"/>
-        </w:rPr>
-      </w:pPr>
-      <w:r>
-        <w:rPr>
-          <w:rFonts w:ascii="Arial" w:eastAsia="Arial" w:hAnsi="Arial" w:cs="Arial"/>
-          <w:i/>
-          <w:iCs/>
-          <w:color w:val="000000"/>
-          <w:sz w:val="22"/>
-          <w:szCs w:val="22"/>
-        </w:rPr>
-        <w:t>O usuário tenta salvar a reprovação sem preencher o campo de texto explicativo.</w:t>
-      </w:r>
-    </w:p>
-    <w:p>
-      <w:pPr>
-        <w:numPr>
-          <w:ilvl w:val="1"/>
-          <w:numId w:val="15"/>
-        </w:numPr>
-        <w:pBdr>
-          <w:top w:val="nil"/>
-          <w:left w:val="nil"/>
-          <w:bottom w:val="nil"/>
-          <w:right w:val="nil"/>
-          <w:between w:val="nil"/>
-        </w:pBdr>
-        <w:spacing w:before="97" w:after="283" w:line="276" w:lineRule="auto"/>
-        <w:ind w:hanging="283"/>
-        <w:rPr>
-          <w:rFonts w:ascii="Arial" w:eastAsia="Arial" w:hAnsi="Arial" w:cs="Arial"/>
-          <w:i/>
-          <w:iCs/>
-          <w:color w:val="000000"/>
-          <w:sz w:val="22"/>
-          <w:szCs w:val="22"/>
-        </w:rPr>
-      </w:pPr>
-      <w:r>
-        <w:rPr>
-          <w:rFonts w:ascii="Arial" w:eastAsia="Arial" w:hAnsi="Arial" w:cs="Arial"/>
-          <w:i/>
-          <w:iCs/>
-          <w:color w:val="000000"/>
-          <w:sz w:val="22"/>
-          <w:szCs w:val="22"/>
-        </w:rPr>
-        <w:t>O sistema interrompe a gravação e valida que a justificativa exige ao menos 10 caracteres.</w:t>
-      </w:r>
-    </w:p>
-    <w:p>
-      <w:pPr>
-        <w:numPr>
-          <w:ilvl w:val="1"/>
-          <w:numId w:val="15"/>
-        </w:numPr>
-        <w:pBdr>
-          <w:top w:val="nil"/>
-          <w:left w:val="nil"/>
-          <w:bottom w:val="nil"/>
-          <w:right w:val="nil"/>
-          <w:between w:val="nil"/>
-        </w:pBdr>
-        <w:spacing w:before="97" w:after="283" w:line="276" w:lineRule="auto"/>
-        <w:ind w:hanging="283"/>
-        <w:rPr>
-          <w:rFonts w:ascii="Arial" w:eastAsia="Arial" w:hAnsi="Arial" w:cs="Arial"/>
-          <w:i/>
-          <w:iCs/>
-          <w:color w:val="000000"/>
-          <w:sz w:val="22"/>
-          <w:szCs w:val="22"/>
-        </w:rPr>
-      </w:pPr>
-      <w:r>
-        <w:rPr>
-          <w:rFonts w:ascii="Arial" w:eastAsia="Arial" w:hAnsi="Arial" w:cs="Arial"/>
-          <w:i/>
-          <w:iCs/>
-          <w:color w:val="000000"/>
-          <w:sz w:val="22"/>
-          <w:szCs w:val="22"/>
-        </w:rPr>
-        <w:t>O sistema emite o alerta: "Informe o motivo da reprovação."</w:t>
-      </w:r>
-    </w:p>
-    <w:p>
-      <w:pPr>
-        <w:numPr>
-          <w:ilvl w:val="1"/>
-          <w:numId w:val="15"/>
-        </w:numPr>
-        <w:pBdr>
-          <w:top w:val="nil"/>
-          <w:left w:val="nil"/>
-          <w:bottom w:val="nil"/>
-          <w:right w:val="nil"/>
-          <w:between w:val="nil"/>
-        </w:pBdr>
-        <w:spacing w:before="97" w:after="283" w:line="276" w:lineRule="auto"/>
-        <w:ind w:hanging="283"/>
-        <w:rPr>
-          <w:rFonts w:ascii="Arial" w:eastAsia="Arial" w:hAnsi="Arial" w:cs="Arial"/>
-          <w:i/>
-          <w:iCs/>
-          <w:color w:val="000000"/>
-          <w:sz w:val="22"/>
-          <w:szCs w:val="22"/>
-        </w:rPr>
-      </w:pPr>
-      <w:r>
-        <w:rPr>
-          <w:rFonts w:ascii="Arial" w:eastAsia="Arial" w:hAnsi="Arial" w:cs="Arial"/>
-          <w:i/>
-          <w:iCs/>
-          <w:color w:val="000000"/>
-          <w:sz w:val="22"/>
-          <w:szCs w:val="22"/>
-        </w:rPr>
-        <w:t>O status da pesquisa é pr</w:t>
-      </w:r>
-      <w:r>
-        <w:rPr>
-          <w:rFonts w:ascii="Arial" w:eastAsia="Arial" w:hAnsi="Arial" w:cs="Arial"/>
-          <w:i/>
-          <w:iCs/>
-          <w:color w:val="000000"/>
-          <w:sz w:val="22"/>
-          <w:szCs w:val="22"/>
-        </w:rPr>
-        <w:t>eservado em análise até o preenchimento válido da justificativa.</w:t>
-      </w:r>
-    </w:p>
-    <w:p>
-      <w:pPr>
-        <w:pStyle w:val="Ttulo4"/>
-        <w:spacing w:before="97" w:after="283" w:line="276" w:lineRule="auto"/>
-        <w:rPr>
-          <w:rFonts w:ascii="Arial" w:eastAsia="Arial" w:hAnsi="Arial" w:cs="Arial"/>
-          <w:i/>
-          <w:iCs/>
-          <w:sz w:val="22"/>
-          <w:szCs w:val="22"/>
-        </w:rPr>
-      </w:pPr>
-      <w:r>
-        <w:rPr>
-          <w:rFonts w:ascii="Arial" w:eastAsia="Arial" w:hAnsi="Arial" w:cs="Arial"/>
-          <w:i/>
-          <w:iCs/>
-          <w:sz w:val="22"/>
-          <w:szCs w:val="22"/>
-        </w:rPr>
-        <w:t>Caso de Uso: Analisar Relatórios Institucionais</w:t>
-      </w:r>
-    </w:p>
-    <w:p>
-      <w:pPr>
-        <w:pBdr>
-          <w:top w:val="nil"/>
-          <w:left w:val="nil"/>
-          <w:bottom w:val="nil"/>
-          <w:right w:val="nil"/>
-          <w:between w:val="nil"/>
-        </w:pBdr>
-        <w:spacing w:before="97" w:after="283" w:line="276" w:lineRule="auto"/>
+      </w:pPr>
+      <w:r>
         <w:rPr>
           <w:rFonts w:ascii="Arial" w:eastAsia="Arial" w:hAnsi="Arial" w:cs="Arial"/>
           <w:b/>
@@ -19395,8 +19433,235 @@
           <w:sz w:val="22"/>
           <w:szCs w:val="22"/>
         </w:rPr>
-      </w:pPr>
-      <w:r>
+        <w:t>Fluxo Principal</w:t>
+      </w:r>
+    </w:p>
+    <w:p>
+      <w:pPr>
+        <w:numPr>
+          <w:ilvl w:val="1"/>
+          <w:numId w:val="16"/>
+        </w:numPr>
+        <w:pBdr>
+          <w:top w:val="nil"/>
+          <w:left w:val="nil"/>
+          <w:bottom w:val="nil"/>
+          <w:right w:val="nil"/>
+          <w:between w:val="nil"/>
+        </w:pBdr>
+        <w:spacing w:before="97" w:after="283" w:line="276" w:lineRule="auto"/>
+        <w:ind w:hanging="283"/>
+        <w:rPr>
+          <w:rFonts w:ascii="Arial" w:eastAsia="Arial" w:hAnsi="Arial" w:cs="Arial"/>
+          <w:i/>
+          <w:iCs/>
+          <w:color w:val="000000"/>
+          <w:sz w:val="22"/>
+          <w:szCs w:val="22"/>
+        </w:rPr>
+      </w:pPr>
+      <w:r>
+        <w:rPr>
+          <w:rFonts w:ascii="Arial" w:eastAsia="Arial" w:hAnsi="Arial" w:cs="Arial"/>
+          <w:i/>
+          <w:iCs/>
+          <w:color w:val="000000"/>
+          <w:sz w:val="22"/>
+          <w:szCs w:val="22"/>
+        </w:rPr>
+        <w:t>O usuário da Secretaria acessa o painel macro de inteligência institucional.</w:t>
+      </w:r>
+    </w:p>
+    <w:p>
+      <w:pPr>
+        <w:numPr>
+          <w:ilvl w:val="1"/>
+          <w:numId w:val="16"/>
+        </w:numPr>
+        <w:pBdr>
+          <w:top w:val="nil"/>
+          <w:left w:val="nil"/>
+          <w:bottom w:val="nil"/>
+          <w:right w:val="nil"/>
+          <w:between w:val="nil"/>
+        </w:pBdr>
+        <w:spacing w:before="97" w:after="283" w:line="276" w:lineRule="auto"/>
+        <w:ind w:hanging="283"/>
+        <w:rPr>
+          <w:rFonts w:ascii="Arial" w:eastAsia="Arial" w:hAnsi="Arial" w:cs="Arial"/>
+          <w:i/>
+          <w:iCs/>
+          <w:color w:val="000000"/>
+          <w:sz w:val="22"/>
+          <w:szCs w:val="22"/>
+        </w:rPr>
+      </w:pPr>
+      <w:r>
+        <w:rPr>
+          <w:rFonts w:ascii="Arial" w:eastAsia="Arial" w:hAnsi="Arial" w:cs="Arial"/>
+          <w:i/>
+          <w:iCs/>
+          <w:color w:val="000000"/>
+          <w:sz w:val="22"/>
+          <w:szCs w:val="22"/>
+        </w:rPr>
+        <w:t>O usuário aplica filtros de visualização com base na unidade ou campus universitário (</w:t>
+      </w:r>
+      <w:r>
+        <w:rPr>
+          <w:rFonts w:ascii="Arial" w:eastAsia="Arial" w:hAnsi="Arial" w:cs="Arial"/>
+          <w:color w:val="000000"/>
+        </w:rPr>
+        <w:t>Filtrar Resultados</w:t>
+      </w:r>
+      <w:r>
+        <w:rPr>
+          <w:rFonts w:ascii="Arial" w:eastAsia="Arial" w:hAnsi="Arial" w:cs="Arial"/>
+          <w:i/>
+          <w:iCs/>
+          <w:color w:val="000000"/>
+          <w:sz w:val="22"/>
+          <w:szCs w:val="22"/>
+        </w:rPr>
+        <w:t>).</w:t>
+      </w:r>
+    </w:p>
+    <w:p>
+      <w:pPr>
+        <w:numPr>
+          <w:ilvl w:val="1"/>
+          <w:numId w:val="16"/>
+        </w:numPr>
+        <w:pBdr>
+          <w:top w:val="nil"/>
+          <w:left w:val="nil"/>
+          <w:bottom w:val="nil"/>
+          <w:right w:val="nil"/>
+          <w:between w:val="nil"/>
+        </w:pBdr>
+        <w:spacing w:before="97" w:after="283" w:line="276" w:lineRule="auto"/>
+        <w:ind w:hanging="283"/>
+        <w:rPr>
+          <w:rFonts w:ascii="Arial" w:eastAsia="Arial" w:hAnsi="Arial" w:cs="Arial"/>
+          <w:i/>
+          <w:iCs/>
+          <w:color w:val="000000"/>
+          <w:sz w:val="22"/>
+          <w:szCs w:val="22"/>
+        </w:rPr>
+      </w:pPr>
+      <w:r>
+        <w:rPr>
+          <w:rFonts w:ascii="Arial" w:eastAsia="Arial" w:hAnsi="Arial" w:cs="Arial"/>
+          <w:i/>
+          <w:iCs/>
+          <w:color w:val="000000"/>
+          <w:sz w:val="22"/>
+          <w:szCs w:val="22"/>
+        </w:rPr>
+        <w:t>O sistema processa e exibe em tela os dados consolidados e agregados de forma institucional e gráfica, omitindo qualquer dado individual.</w:t>
+      </w:r>
+    </w:p>
+    <w:p>
+      <w:pPr>
+        <w:numPr>
+          <w:ilvl w:val="1"/>
+          <w:numId w:val="16"/>
+        </w:numPr>
+        <w:pBdr>
+          <w:top w:val="nil"/>
+          <w:left w:val="nil"/>
+          <w:bottom w:val="nil"/>
+          <w:right w:val="nil"/>
+          <w:between w:val="nil"/>
+        </w:pBdr>
+        <w:spacing w:before="97" w:after="283" w:line="276" w:lineRule="auto"/>
+        <w:ind w:hanging="283"/>
+        <w:rPr>
+          <w:rFonts w:ascii="Arial" w:eastAsia="Arial" w:hAnsi="Arial" w:cs="Arial"/>
+          <w:i/>
+          <w:iCs/>
+          <w:color w:val="000000"/>
+          <w:sz w:val="22"/>
+          <w:szCs w:val="22"/>
+        </w:rPr>
+      </w:pPr>
+      <w:r>
+        <w:rPr>
+          <w:rFonts w:ascii="Arial" w:eastAsia="Arial" w:hAnsi="Arial" w:cs="Arial"/>
+          <w:i/>
+          <w:iCs/>
+          <w:color w:val="000000"/>
+          <w:sz w:val="22"/>
+          <w:szCs w:val="22"/>
+        </w:rPr>
+        <w:t>O usuário opta por documentar e clica em "Exportar Relatório" (</w:t>
+      </w:r>
+      <w:r>
+        <w:rPr>
+          <w:rFonts w:ascii="Arial" w:eastAsia="Arial" w:hAnsi="Arial" w:cs="Arial"/>
+          <w:color w:val="000000"/>
+        </w:rPr>
+        <w:t>Exportar PDF/Excel</w:t>
+      </w:r>
+      <w:r>
+        <w:rPr>
+          <w:rFonts w:ascii="Arial" w:eastAsia="Arial" w:hAnsi="Arial" w:cs="Arial"/>
+          <w:i/>
+          <w:iCs/>
+          <w:color w:val="000000"/>
+          <w:sz w:val="22"/>
+          <w:szCs w:val="22"/>
+        </w:rPr>
+        <w:t>).</w:t>
+      </w:r>
+    </w:p>
+    <w:p>
+      <w:pPr>
+        <w:numPr>
+          <w:ilvl w:val="1"/>
+          <w:numId w:val="16"/>
+        </w:numPr>
+        <w:pBdr>
+          <w:top w:val="nil"/>
+          <w:left w:val="nil"/>
+          <w:bottom w:val="nil"/>
+          <w:right w:val="nil"/>
+          <w:between w:val="nil"/>
+        </w:pBdr>
+        <w:spacing w:before="97" w:after="283" w:line="276" w:lineRule="auto"/>
+        <w:ind w:hanging="283"/>
+        <w:rPr>
+          <w:rFonts w:ascii="Arial" w:eastAsia="Arial" w:hAnsi="Arial" w:cs="Arial"/>
+          <w:i/>
+          <w:iCs/>
+          <w:color w:val="000000"/>
+          <w:sz w:val="22"/>
+          <w:szCs w:val="22"/>
+        </w:rPr>
+      </w:pPr>
+      <w:r>
+        <w:rPr>
+          <w:rFonts w:ascii="Arial" w:eastAsia="Arial" w:hAnsi="Arial" w:cs="Arial"/>
+          <w:i/>
+          <w:iCs/>
+          <w:color w:val="000000"/>
+          <w:sz w:val="22"/>
+          <w:szCs w:val="22"/>
+        </w:rPr>
+        <w:t>O sistema gera um documento estruturado contendo o brasão e a identidade visual oficial da instituição.</w:t>
+      </w:r>
+    </w:p>
+    <w:p>
+      <w:pPr>
+        <w:pBdr>
+          <w:top w:val="nil"/>
+          <w:left w:val="nil"/>
+          <w:bottom w:val="nil"/>
+          <w:right w:val="nil"/>
+          <w:between w:val="nil"/>
+        </w:pBdr>
+        <w:spacing w:before="97" w:after="283" w:line="276" w:lineRule="auto"/>
         <w:rPr>
           <w:rFonts w:ascii="Arial" w:eastAsia="Arial" w:hAnsi="Arial" w:cs="Arial"/>
           <w:b/>
@@ -19407,235 +19672,8 @@
           <w:sz w:val="22"/>
           <w:szCs w:val="22"/>
         </w:rPr>
-        <w:t>Fluxo Principal</w:t>
-      </w:r>
-    </w:p>
-    <w:p>
-      <w:pPr>
-        <w:numPr>
-          <w:ilvl w:val="1"/>
-          <w:numId w:val="16"/>
-        </w:numPr>
-        <w:pBdr>
-          <w:top w:val="nil"/>
-          <w:left w:val="nil"/>
-          <w:bottom w:val="nil"/>
-          <w:right w:val="nil"/>
-          <w:between w:val="nil"/>
-        </w:pBdr>
-        <w:spacing w:before="97" w:after="283" w:line="276" w:lineRule="auto"/>
-        <w:ind w:hanging="283"/>
-        <w:rPr>
-          <w:rFonts w:ascii="Arial" w:eastAsia="Arial" w:hAnsi="Arial" w:cs="Arial"/>
-          <w:i/>
-          <w:iCs/>
-          <w:color w:val="000000"/>
-          <w:sz w:val="22"/>
-          <w:szCs w:val="22"/>
-        </w:rPr>
-      </w:pPr>
-      <w:r>
-        <w:rPr>
-          <w:rFonts w:ascii="Arial" w:eastAsia="Arial" w:hAnsi="Arial" w:cs="Arial"/>
-          <w:i/>
-          <w:iCs/>
-          <w:color w:val="000000"/>
-          <w:sz w:val="22"/>
-          <w:szCs w:val="22"/>
-        </w:rPr>
-        <w:t>O usuário da Secretaria acessa o painel macro de inteligência institucional.</w:t>
-      </w:r>
-    </w:p>
-    <w:p>
-      <w:pPr>
-        <w:numPr>
-          <w:ilvl w:val="1"/>
-          <w:numId w:val="16"/>
-        </w:numPr>
-        <w:pBdr>
-          <w:top w:val="nil"/>
-          <w:left w:val="nil"/>
-          <w:bottom w:val="nil"/>
-          <w:right w:val="nil"/>
-          <w:between w:val="nil"/>
-        </w:pBdr>
-        <w:spacing w:before="97" w:after="283" w:line="276" w:lineRule="auto"/>
-        <w:ind w:hanging="283"/>
-        <w:rPr>
-          <w:rFonts w:ascii="Arial" w:eastAsia="Arial" w:hAnsi="Arial" w:cs="Arial"/>
-          <w:i/>
-          <w:iCs/>
-          <w:color w:val="000000"/>
-          <w:sz w:val="22"/>
-          <w:szCs w:val="22"/>
-        </w:rPr>
-      </w:pPr>
-      <w:r>
-        <w:rPr>
-          <w:rFonts w:ascii="Arial" w:eastAsia="Arial" w:hAnsi="Arial" w:cs="Arial"/>
-          <w:i/>
-          <w:iCs/>
-          <w:color w:val="000000"/>
-          <w:sz w:val="22"/>
-          <w:szCs w:val="22"/>
-        </w:rPr>
-        <w:t>O usuário aplica filtros de visualização com base na unidade ou campus universitário (</w:t>
-      </w:r>
-      <w:r>
-        <w:rPr>
-          <w:rFonts w:ascii="Arial" w:eastAsia="Arial" w:hAnsi="Arial" w:cs="Arial"/>
-          <w:color w:val="000000"/>
-        </w:rPr>
-        <w:t>Filtrar Resultados</w:t>
-      </w:r>
-      <w:r>
-        <w:rPr>
-          <w:rFonts w:ascii="Arial" w:eastAsia="Arial" w:hAnsi="Arial" w:cs="Arial"/>
-          <w:i/>
-          <w:iCs/>
-          <w:color w:val="000000"/>
-          <w:sz w:val="22"/>
-          <w:szCs w:val="22"/>
-        </w:rPr>
-        <w:t>).</w:t>
-      </w:r>
-    </w:p>
-    <w:p>
-      <w:pPr>
-        <w:numPr>
-          <w:ilvl w:val="1"/>
-          <w:numId w:val="16"/>
-        </w:numPr>
-        <w:pBdr>
-          <w:top w:val="nil"/>
-          <w:left w:val="nil"/>
-          <w:bottom w:val="nil"/>
-          <w:right w:val="nil"/>
-          <w:between w:val="nil"/>
-        </w:pBdr>
-        <w:spacing w:before="97" w:after="283" w:line="276" w:lineRule="auto"/>
-        <w:ind w:hanging="283"/>
-        <w:rPr>
-          <w:rFonts w:ascii="Arial" w:eastAsia="Arial" w:hAnsi="Arial" w:cs="Arial"/>
-          <w:i/>
-          <w:iCs/>
-          <w:color w:val="000000"/>
-          <w:sz w:val="22"/>
-          <w:szCs w:val="22"/>
-        </w:rPr>
-      </w:pPr>
-      <w:r>
-        <w:rPr>
-          <w:rFonts w:ascii="Arial" w:eastAsia="Arial" w:hAnsi="Arial" w:cs="Arial"/>
-          <w:i/>
-          <w:iCs/>
-          <w:color w:val="000000"/>
-          <w:sz w:val="22"/>
-          <w:szCs w:val="22"/>
-        </w:rPr>
-        <w:t>O sistema processa e exibe em tela os dados consolidados e agregados de forma institucional e gráfica, omitindo qualquer dado individual.</w:t>
-      </w:r>
-    </w:p>
-    <w:p>
-      <w:pPr>
-        <w:numPr>
-          <w:ilvl w:val="1"/>
-          <w:numId w:val="16"/>
-        </w:numPr>
-        <w:pBdr>
-          <w:top w:val="nil"/>
-          <w:left w:val="nil"/>
-          <w:bottom w:val="nil"/>
-          <w:right w:val="nil"/>
-          <w:between w:val="nil"/>
-        </w:pBdr>
-        <w:spacing w:before="97" w:after="283" w:line="276" w:lineRule="auto"/>
-        <w:ind w:hanging="283"/>
-        <w:rPr>
-          <w:rFonts w:ascii="Arial" w:eastAsia="Arial" w:hAnsi="Arial" w:cs="Arial"/>
-          <w:i/>
-          <w:iCs/>
-          <w:color w:val="000000"/>
-          <w:sz w:val="22"/>
-          <w:szCs w:val="22"/>
-        </w:rPr>
-      </w:pPr>
-      <w:r>
-        <w:rPr>
-          <w:rFonts w:ascii="Arial" w:eastAsia="Arial" w:hAnsi="Arial" w:cs="Arial"/>
-          <w:i/>
-          <w:iCs/>
-          <w:color w:val="000000"/>
-          <w:sz w:val="22"/>
-          <w:szCs w:val="22"/>
-        </w:rPr>
-        <w:t>O usuário opta por documentar e clica em "Exportar Relatório" (</w:t>
-      </w:r>
-      <w:r>
-        <w:rPr>
-          <w:rFonts w:ascii="Arial" w:eastAsia="Arial" w:hAnsi="Arial" w:cs="Arial"/>
-          <w:color w:val="000000"/>
-        </w:rPr>
-        <w:t>Exportar PDF/Excel</w:t>
-      </w:r>
-      <w:r>
-        <w:rPr>
-          <w:rFonts w:ascii="Arial" w:eastAsia="Arial" w:hAnsi="Arial" w:cs="Arial"/>
-          <w:i/>
-          <w:iCs/>
-          <w:color w:val="000000"/>
-          <w:sz w:val="22"/>
-          <w:szCs w:val="22"/>
-        </w:rPr>
-        <w:t>).</w:t>
-      </w:r>
-    </w:p>
-    <w:p>
-      <w:pPr>
-        <w:numPr>
-          <w:ilvl w:val="1"/>
-          <w:numId w:val="16"/>
-        </w:numPr>
-        <w:pBdr>
-          <w:top w:val="nil"/>
-          <w:left w:val="nil"/>
-          <w:bottom w:val="nil"/>
-          <w:right w:val="nil"/>
-          <w:between w:val="nil"/>
-        </w:pBdr>
-        <w:spacing w:before="97" w:after="283" w:line="276" w:lineRule="auto"/>
-        <w:ind w:hanging="283"/>
-        <w:rPr>
-          <w:rFonts w:ascii="Arial" w:eastAsia="Arial" w:hAnsi="Arial" w:cs="Arial"/>
-          <w:i/>
-          <w:iCs/>
-          <w:color w:val="000000"/>
-          <w:sz w:val="22"/>
-          <w:szCs w:val="22"/>
-        </w:rPr>
-      </w:pPr>
-      <w:r>
-        <w:rPr>
-          <w:rFonts w:ascii="Arial" w:eastAsia="Arial" w:hAnsi="Arial" w:cs="Arial"/>
-          <w:i/>
-          <w:iCs/>
-          <w:color w:val="000000"/>
-          <w:sz w:val="22"/>
-          <w:szCs w:val="22"/>
-        </w:rPr>
-        <w:t>O sistema gera um documento estruturado contendo o brasão e a identidade visual oficial da instituição.</w:t>
-      </w:r>
-    </w:p>
-    <w:p>
-      <w:pPr>
-        <w:pBdr>
-          <w:top w:val="nil"/>
-          <w:left w:val="nil"/>
-          <w:bottom w:val="nil"/>
-          <w:right w:val="nil"/>
-          <w:between w:val="nil"/>
-        </w:pBdr>
-        <w:spacing w:before="97" w:after="283" w:line="276" w:lineRule="auto"/>
+      </w:pPr>
+      <w:r>
         <w:rPr>
           <w:rFonts w:ascii="Arial" w:eastAsia="Arial" w:hAnsi="Arial" w:cs="Arial"/>
           <w:b/>
@@ -19646,18 +19684,6 @@
           <w:sz w:val="22"/>
           <w:szCs w:val="22"/>
         </w:rPr>
-      </w:pPr>
-      <w:r>
-        <w:rPr>
-          <w:rFonts w:ascii="Arial" w:eastAsia="Arial" w:hAnsi="Arial" w:cs="Arial"/>
-          <w:b/>
-          <w:bCs/>
-          <w:i/>
-          <w:iCs/>
-          <w:color w:val="000000"/>
-          <w:sz w:val="22"/>
-          <w:szCs w:val="22"/>
-        </w:rPr>
         <w:t>Fluxo Alternativo (Ausência de Amostragem no Filtro):</w:t>
       </w:r>
     </w:p>
@@ -19694,18 +19720,7 @@
           <w:sz w:val="22"/>
           <w:szCs w:val="22"/>
         </w:rPr>
-        <w:t xml:space="preserve">No passo 2 do </w:t>
-      </w:r>
-      <w:r>
-        <w:rPr>
-          <w:rFonts w:ascii="Arial" w:eastAsia="Arial" w:hAnsi="Arial" w:cs="Arial"/>
-          <w:i/>
-          <w:iCs/>
-          <w:color w:val="000000"/>
-          <w:sz w:val="22"/>
-          <w:szCs w:val="22"/>
-        </w:rPr>
-        <w:t>fluxo principal, o usuário escolhe um período ou campus específico onde nenhuma categoria de respondente registrou respostas.</w:t>
+        <w:t>No passo 2 do fluxo principal, o usuário escolhe um período ou campus específico onde nenhuma categoria de respondente registrou respostas.</w:t>
       </w:r>
     </w:p>
     <w:p>
@@ -19777,18 +19792,7 @@
           <w:sz w:val="22"/>
           <w:szCs w:val="22"/>
         </w:rPr>
-        <w:t>O sistema cancela a operação de exportação de lay</w:t>
-      </w:r>
-      <w:r>
-        <w:rPr>
-          <w:rFonts w:ascii="Arial" w:eastAsia="Arial" w:hAnsi="Arial" w:cs="Arial"/>
-          <w:i/>
-          <w:iCs/>
-          <w:color w:val="000000"/>
-          <w:sz w:val="22"/>
-          <w:szCs w:val="22"/>
-        </w:rPr>
-        <w:t>out em branco.</w:t>
+        <w:t>O sistema cancela a operação de exportação de layout em branco.</w:t>
       </w:r>
     </w:p>
     <w:p>
@@ -20361,16 +20365,7 @@
           <w:bCs/>
           <w:color w:val="000000"/>
         </w:rPr>
-        <w:t>Secret</w:t>
-      </w:r>
-      <w:r>
-        <w:rPr>
-          <w:rFonts w:ascii="Arial" w:eastAsia="Arial" w:hAnsi="Arial" w:cs="Arial"/>
-          <w:b/>
-          <w:bCs/>
-          <w:color w:val="000000"/>
-        </w:rPr>
-        <w:t>aria</w:t>
+        <w:t>Secretaria</w:t>
       </w:r>
       <w:r>
         <w:rPr>
@@ -20868,8 +20863,8 @@
           <w:szCs w:val="22"/>
         </w:rPr>
       </w:pPr>
-      <w:bookmarkStart w:id="17" w:name="_6i3l4tolhdur" w:colFirst="0" w:colLast="0"/>
-      <w:bookmarkEnd w:id="17"/>
+      <w:bookmarkStart w:id="11" w:name="_6i3l4tolhdur" w:colFirst="0" w:colLast="0"/>
+      <w:bookmarkEnd w:id="11"/>
       <w:r>
         <w:rPr>
           <w:rFonts w:ascii="Arial" w:eastAsia="Arial" w:hAnsi="Arial" w:cs="Arial"/>
@@ -21015,14 +21010,7 @@
           <w:rFonts w:ascii="Arial" w:eastAsia="Arial" w:hAnsi="Arial" w:cs="Arial"/>
           <w:color w:val="000000"/>
         </w:rPr>
-        <w:t>Aplicar Fil</w:t>
-      </w:r>
-      <w:r>
-        <w:rPr>
-          <w:rFonts w:ascii="Arial" w:eastAsia="Arial" w:hAnsi="Arial" w:cs="Arial"/>
-          <w:color w:val="000000"/>
-        </w:rPr>
-        <w:t>tros Avançados</w:t>
+        <w:t>Aplicar Filtros Avançados</w:t>
       </w:r>
       <w:r>
         <w:rPr>
@@ -21140,18 +21128,7 @@
           <w:sz w:val="22"/>
           <w:szCs w:val="22"/>
         </w:rPr>
-        <w:t>No passo 3 do fluxo principal, o Analista clica em "Processar Gráfico</w:t>
-      </w:r>
-      <w:r>
-        <w:rPr>
-          <w:rFonts w:ascii="Arial" w:eastAsia="Arial" w:hAnsi="Arial" w:cs="Arial"/>
-          <w:i/>
-          <w:iCs/>
-          <w:color w:val="000000"/>
-          <w:sz w:val="22"/>
-          <w:szCs w:val="22"/>
-        </w:rPr>
-        <w:t>s" deixando todos os critérios de busca e filtros em branco.</w:t>
+        <w:t>No passo 3 do fluxo principal, o Analista clica em "Processar Gráficos" deixando todos os critérios de busca e filtros em branco.</w:t>
       </w:r>
     </w:p>
     <w:p>
@@ -21487,14 +21464,7 @@
           <w:rFonts w:ascii="Arial" w:eastAsia="Arial" w:hAnsi="Arial" w:cs="Arial"/>
           <w:color w:val="000000"/>
         </w:rPr>
-        <w:t>Registr</w:t>
-      </w:r>
-      <w:r>
-        <w:rPr>
-          <w:rFonts w:ascii="Arial" w:eastAsia="Arial" w:hAnsi="Arial" w:cs="Arial"/>
-          <w:color w:val="000000"/>
-        </w:rPr>
-        <w:t>ar Log</w:t>
+        <w:t>Registrar Log</w:t>
       </w:r>
       <w:r>
         <w:rPr>
@@ -21577,18 +21547,7 @@
           <w:sz w:val="22"/>
           <w:szCs w:val="22"/>
         </w:rPr>
-        <w:t xml:space="preserve">No passo 1 do fluxo principal, ao tentar efetuar a exportação de uma pesquisa cujos questionários ainda não receberam nenhuma </w:t>
-      </w:r>
-      <w:r>
-        <w:rPr>
-          <w:rFonts w:ascii="Arial" w:eastAsia="Arial" w:hAnsi="Arial" w:cs="Arial"/>
-          <w:i/>
-          <w:iCs/>
-          <w:color w:val="000000"/>
-          <w:sz w:val="22"/>
-          <w:szCs w:val="22"/>
-        </w:rPr>
-        <w:t>interação.</w:t>
+        <w:t>No passo 1 do fluxo principal, ao tentar efetuar a exportação de uma pesquisa cujos questionários ainda não receberam nenhuma interação.</w:t>
       </w:r>
     </w:p>
     <w:p>
@@ -22856,18 +22815,7 @@
           <w:sz w:val="22"/>
           <w:szCs w:val="22"/>
         </w:rPr>
-        <w:t>O sistema exibe um dashboard administrativo atualizado de forma síncrona a ca</w:t>
-      </w:r>
-      <w:r>
-        <w:rPr>
-          <w:rFonts w:ascii="Arial" w:eastAsia="Arial" w:hAnsi="Arial" w:cs="Arial"/>
-          <w:i/>
-          <w:iCs/>
-          <w:color w:val="000000"/>
-          <w:sz w:val="22"/>
-          <w:szCs w:val="22"/>
-        </w:rPr>
-        <w:t>da 30 segundos, exibindo o status de APIs, banco de dados e servidores.</w:t>
+        <w:t>O sistema exibe um dashboard administrativo atualizado de forma síncrona a cada 30 segundos, exibindo o status de APIs, banco de dados e servidores.</w:t>
       </w:r>
     </w:p>
     <w:p>
@@ -23047,18 +22995,7 @@
           <w:sz w:val="22"/>
           <w:szCs w:val="22"/>
         </w:rPr>
-        <w:t>O sistema executa a trigger de contingência aut</w:t>
-      </w:r>
-      <w:r>
-        <w:rPr>
-          <w:rFonts w:ascii="Arial" w:eastAsia="Arial" w:hAnsi="Arial" w:cs="Arial"/>
-          <w:i/>
-          <w:iCs/>
-          <w:color w:val="000000"/>
-          <w:sz w:val="22"/>
-          <w:szCs w:val="22"/>
-        </w:rPr>
-        <w:t>omatizada (</w:t>
+        <w:t>O sistema executa a trigger de contingência automatizada (</w:t>
       </w:r>
       <w:r>
         <w:rPr>
@@ -23460,18 +23397,7 @@
           <w:sz w:val="22"/>
           <w:szCs w:val="22"/>
         </w:rPr>
-        <w:t>No passo 2 do fluxo principal, o operador tenta abrir um novo registro na central para documentar um erro d</w:t>
-      </w:r>
-      <w:r>
-        <w:rPr>
-          <w:rFonts w:ascii="Arial" w:eastAsia="Arial" w:hAnsi="Arial" w:cs="Arial"/>
-          <w:i/>
-          <w:iCs/>
-          <w:color w:val="000000"/>
-          <w:sz w:val="22"/>
-          <w:szCs w:val="22"/>
-        </w:rPr>
-        <w:t>e banco de dados que acabou de ocorrer.</w:t>
+        <w:t>No passo 2 do fluxo principal, o operador tenta abrir um novo registro na central para documentar um erro de banco de dados que acabou de ocorrer.</w:t>
       </w:r>
     </w:p>
     <w:p>
@@ -23543,18 +23469,7 @@
           <w:sz w:val="22"/>
           <w:szCs w:val="22"/>
         </w:rPr>
-        <w:t>A duplicação é travada na interface para não fragmentar</w:t>
-      </w:r>
-      <w:r>
-        <w:rPr>
-          <w:rFonts w:ascii="Arial" w:eastAsia="Arial" w:hAnsi="Arial" w:cs="Arial"/>
-          <w:i/>
-          <w:iCs/>
-          <w:color w:val="000000"/>
-          <w:sz w:val="22"/>
-          <w:szCs w:val="22"/>
-        </w:rPr>
-        <w:t xml:space="preserve"> as métricas.</w:t>
+        <w:t>A duplicação é travada na interface para não fragmentar as métricas.</w:t>
       </w:r>
     </w:p>
     <w:p>
@@ -24600,18 +24515,7 @@
           <w:sz w:val="22"/>
           <w:szCs w:val="22"/>
         </w:rPr>
-        <w:t>O Auditor acessa o módulo avançado de conformidade do sis</w:t>
-      </w:r>
-      <w:r>
-        <w:rPr>
-          <w:rFonts w:ascii="Arial" w:eastAsia="Arial" w:hAnsi="Arial" w:cs="Arial"/>
-          <w:i/>
-          <w:iCs/>
-          <w:color w:val="000000"/>
-          <w:sz w:val="22"/>
-          <w:szCs w:val="22"/>
-        </w:rPr>
-        <w:t>tema.</w:t>
+        <w:t>O Auditor acessa o módulo avançado de conformidade do sistema.</w:t>
       </w:r>
     </w:p>
     <w:p>
@@ -24846,18 +24750,7 @@
           <w:sz w:val="22"/>
           <w:szCs w:val="22"/>
         </w:rPr>
-        <w:t>O sistema de proteção de banco impede a leitura direta para evitar colisões de consis</w:t>
-      </w:r>
-      <w:r>
-        <w:rPr>
-          <w:rFonts w:ascii="Arial" w:eastAsia="Arial" w:hAnsi="Arial" w:cs="Arial"/>
-          <w:i/>
-          <w:iCs/>
-          <w:color w:val="000000"/>
-          <w:sz w:val="22"/>
-          <w:szCs w:val="22"/>
-        </w:rPr>
-        <w:t>tência.</w:t>
+        <w:t>O sistema de proteção de banco impede a leitura direta para evitar colisões de consistência.</w:t>
       </w:r>
     </w:p>
     <w:p>
@@ -25204,18 +25097,7 @@
           <w:sz w:val="22"/>
           <w:szCs w:val="22"/>
         </w:rPr>
-        <w:t>No passo 2 do fluxo principal, a varredura do Auditor detecta que um determinado parâmetro de s</w:t>
-      </w:r>
-      <w:r>
-        <w:rPr>
-          <w:rFonts w:ascii="Arial" w:eastAsia="Arial" w:hAnsi="Arial" w:cs="Arial"/>
-          <w:i/>
-          <w:iCs/>
-          <w:color w:val="000000"/>
-          <w:sz w:val="22"/>
-          <w:szCs w:val="22"/>
-        </w:rPr>
-        <w:t>egurança não foi atendido (</w:t>
+        <w:t>No passo 2 do fluxo principal, a varredura do Auditor detecta que um determinado parâmetro de segurança não foi atendido (</w:t>
       </w:r>
       <w:r>
         <w:rPr>
@@ -25303,18 +25185,7 @@
           <w:sz w:val="22"/>
           <w:szCs w:val="22"/>
         </w:rPr>
-        <w:t>O sistema sinaliza as anomalias em vermelho no relatório estruturado, gravando o alerta no painel administrativo com o detalhamento da fal</w:t>
-      </w:r>
-      <w:r>
-        <w:rPr>
-          <w:rFonts w:ascii="Arial" w:eastAsia="Arial" w:hAnsi="Arial" w:cs="Arial"/>
-          <w:i/>
-          <w:iCs/>
-          <w:color w:val="000000"/>
-          <w:sz w:val="22"/>
-          <w:szCs w:val="22"/>
-        </w:rPr>
-        <w:t>ha encontrada</w:t>
+        <w:t>O sistema sinaliza as anomalias em vermelho no relatório estruturado, gravando o alerta no painel administrativo com o detalhamento da falha encontrada</w:t>
       </w:r>
     </w:p>
     <w:p>
@@ -26164,14 +26035,7 @@
           <w:rFonts w:ascii="Arial" w:eastAsia="Arial" w:hAnsi="Arial" w:cs="Arial"/>
           <w:color w:val="000000"/>
         </w:rPr>
-        <w:t>Gera evidências para auditor</w:t>
-      </w:r>
-      <w:r>
-        <w:rPr>
-          <w:rFonts w:ascii="Arial" w:eastAsia="Arial" w:hAnsi="Arial" w:cs="Arial"/>
-          <w:color w:val="000000"/>
-        </w:rPr>
-        <w:t>ia externa</w:t>
+        <w:t>Gera evidências para auditoria externa</w:t>
       </w:r>
     </w:p>
     <w:p>
@@ -26605,14 +26469,7 @@
           <w:rFonts w:ascii="Arial" w:eastAsia="Arial" w:hAnsi="Arial" w:cs="Arial"/>
           <w:color w:val="000000"/>
         </w:rPr>
-        <w:t>7. O sistema deve possuir proteção contra ataques que com</w:t>
-      </w:r>
-      <w:r>
-        <w:rPr>
-          <w:rFonts w:ascii="Arial" w:eastAsia="Arial" w:hAnsi="Arial" w:cs="Arial"/>
-          <w:color w:val="000000"/>
-        </w:rPr>
-        <w:t>prometam a</w:t>
+        <w:t>7. O sistema deve possuir proteção contra ataques que comprometam a</w:t>
       </w:r>
     </w:p>
     <w:p>
@@ -26708,14 +26565,7 @@
           <w:rFonts w:ascii="Arial" w:eastAsia="Arial" w:hAnsi="Arial" w:cs="Arial"/>
           <w:color w:val="000000"/>
         </w:rPr>
-        <w:t>9. O sistema deve limitar requisições excessivas para evitar sobrecarga do serv</w:t>
-      </w:r>
-      <w:r>
-        <w:rPr>
-          <w:rFonts w:ascii="Arial" w:eastAsia="Arial" w:hAnsi="Arial" w:cs="Arial"/>
-          <w:color w:val="000000"/>
-        </w:rPr>
-        <w:t>idor e</w:t>
+        <w:t>9. O sistema deve limitar requisições excessivas para evitar sobrecarga do servidor e</w:t>
       </w:r>
     </w:p>
     <w:p>
@@ -27247,14 +27097,7 @@
           <w:rFonts w:ascii="Arial" w:eastAsia="Arial" w:hAnsi="Arial" w:cs="Arial"/>
           <w:color w:val="000000"/>
         </w:rPr>
-        <w:t>Receita F</w:t>
-      </w:r>
-      <w:r>
-        <w:rPr>
-          <w:rFonts w:ascii="Arial" w:eastAsia="Arial" w:hAnsi="Arial" w:cs="Arial"/>
-          <w:color w:val="000000"/>
-        </w:rPr>
-        <w:t>ederal.</w:t>
+        <w:t>Receita Federal.</w:t>
       </w:r>
     </w:p>
     <w:p>
@@ -27391,14 +27234,7 @@
           <w:rFonts w:ascii="Arial" w:eastAsia="Arial" w:hAnsi="Arial" w:cs="Arial"/>
           <w:color w:val="000000"/>
         </w:rPr>
-        <w:t>8. O sistema deve vali</w:t>
-      </w:r>
-      <w:r>
-        <w:rPr>
-          <w:rFonts w:ascii="Arial" w:eastAsia="Arial" w:hAnsi="Arial" w:cs="Arial"/>
-          <w:color w:val="000000"/>
-        </w:rPr>
-        <w:t>dar campos obrigatórios antes da gravação no banco de dados.</w:t>
+        <w:t>8. O sistema deve validar campos obrigatórios antes da gravação no banco de dados.</w:t>
       </w:r>
     </w:p>
     <w:p>
@@ -27759,14 +27595,7 @@
           <w:rFonts w:ascii="Arial" w:eastAsia="Arial" w:hAnsi="Arial" w:cs="Arial"/>
           <w:color w:val="000000"/>
         </w:rPr>
-        <w:t>rastreabili</w:t>
-      </w:r>
-      <w:r>
-        <w:rPr>
-          <w:rFonts w:ascii="Arial" w:eastAsia="Arial" w:hAnsi="Arial" w:cs="Arial"/>
-          <w:color w:val="000000"/>
-        </w:rPr>
-        <w:t>dade por um periodo determinado conforme politicas de segurança da</w:t>
+        <w:t>rastreabilidade por um periodo determinado conforme politicas de segurança da</w:t>
       </w:r>
     </w:p>
     <w:p>
@@ -27929,14 +27758,7 @@
           <w:rFonts w:ascii="Arial" w:eastAsia="Arial" w:hAnsi="Arial" w:cs="Arial"/>
           <w:color w:val="000000"/>
         </w:rPr>
-        <w:t xml:space="preserve">O </w:t>
-      </w:r>
-      <w:r>
-        <w:rPr>
-          <w:rFonts w:ascii="Arial" w:eastAsia="Arial" w:hAnsi="Arial" w:cs="Arial"/>
-          <w:color w:val="000000"/>
-        </w:rPr>
-        <w:t>sistema deve garantir que as informações sejam acessadas apenas por pessoas</w:t>
+        <w:t>O sistema deve garantir que as informações sejam acessadas apenas por pessoas</w:t>
       </w:r>
     </w:p>
     <w:p>
@@ -28193,14 +28015,7 @@
           <w:rFonts w:ascii="Arial" w:eastAsia="Arial" w:hAnsi="Arial" w:cs="Arial"/>
           <w:color w:val="000000"/>
         </w:rPr>
-        <w:t>6.</w:t>
-      </w:r>
-      <w:r>
-        <w:rPr>
-          <w:rFonts w:ascii="Arial" w:eastAsia="Arial" w:hAnsi="Arial" w:cs="Arial"/>
-          <w:color w:val="000000"/>
-        </w:rPr>
-        <w:t xml:space="preserve"> O sistema deve restringir o acesso às informações sensíveis apenas a usuários</w:t>
+        <w:t>6. O sistema deve restringir o acesso às informações sensíveis apenas a usuários</w:t>
       </w:r>
     </w:p>
     <w:p>
@@ -28272,14 +28087,7 @@
           <w:rFonts w:ascii="Arial" w:eastAsia="Arial" w:hAnsi="Arial" w:cs="Arial"/>
           <w:color w:val="000000"/>
         </w:rPr>
-        <w:t>em conformidade com a Lei G</w:t>
-      </w:r>
-      <w:r>
-        <w:rPr>
-          <w:rFonts w:ascii="Arial" w:eastAsia="Arial" w:hAnsi="Arial" w:cs="Arial"/>
-          <w:color w:val="000000"/>
-        </w:rPr>
-        <w:t>eral de Proteção de Dados (LGPD).</w:t>
+        <w:t>em conformidade com a Lei Geral de Proteção de Dados (LGPD).</w:t>
       </w:r>
     </w:p>
     <w:p>
@@ -28455,14 +28263,7 @@
           <w:rFonts w:ascii="Arial" w:eastAsia="Arial" w:hAnsi="Arial" w:cs="Arial"/>
           <w:color w:val="000000"/>
         </w:rPr>
-        <w:t>possua apenas</w:t>
-      </w:r>
-      <w:r>
-        <w:rPr>
-          <w:rFonts w:ascii="Arial" w:eastAsia="Arial" w:hAnsi="Arial" w:cs="Arial"/>
-          <w:color w:val="000000"/>
-        </w:rPr>
-        <w:t xml:space="preserve"> as permissões necessárias para execução de suas atividades.</w:t>
+        <w:t>possua apenas as permissões necessárias para execução de suas atividades.</w:t>
       </w:r>
     </w:p>
     <w:p>
@@ -28766,14 +28567,7 @@
           <w:rFonts w:ascii="Arial" w:eastAsia="Arial" w:hAnsi="Arial" w:cs="Arial"/>
           <w:color w:val="000000"/>
         </w:rPr>
-        <w:t xml:space="preserve">   7. O sistema deve impedir alterações indevidas em</w:t>
-      </w:r>
-      <w:r>
-        <w:rPr>
-          <w:rFonts w:ascii="Arial" w:eastAsia="Arial" w:hAnsi="Arial" w:cs="Arial"/>
-          <w:color w:val="000000"/>
-        </w:rPr>
-        <w:t xml:space="preserve"> registros críticos sem autorização</w:t>
+        <w:t xml:space="preserve">   7. O sistema deve impedir alterações indevidas em registros críticos sem autorização</w:t>
       </w:r>
     </w:p>
     <w:p>
@@ -28893,14 +28687,7 @@
           <w:rFonts w:ascii="Arial" w:eastAsia="Arial" w:hAnsi="Arial" w:cs="Arial"/>
           <w:color w:val="000000"/>
         </w:rPr>
-        <w:t>9. O sistema deve impedir mú</w:t>
-      </w:r>
-      <w:r>
-        <w:rPr>
-          <w:rFonts w:ascii="Arial" w:eastAsia="Arial" w:hAnsi="Arial" w:cs="Arial"/>
-          <w:color w:val="000000"/>
-        </w:rPr>
-        <w:t>ltiplos acessos simultâneos indevidos utilizando a</w:t>
+        <w:t>9. O sistema deve impedir múltiplos acessos simultâneos indevidos utilizando a</w:t>
       </w:r>
     </w:p>
     <w:p>
@@ -29255,13 +29042,7 @@
         <w:rPr>
           <w:rFonts w:ascii="Arial" w:eastAsia="Arial" w:hAnsi="Arial" w:cs="Arial"/>
         </w:rPr>
-        <w:t>O desenvolvimento deste projeto técnico permitiu aplicar de forma prática os pilares fundamentais da Engenharia de Software, concentran</w:t>
-      </w:r>
-      <w:r>
-        <w:rPr>
-          <w:rFonts w:ascii="Arial" w:eastAsia="Arial" w:hAnsi="Arial" w:cs="Arial"/>
-        </w:rPr>
-        <w:t xml:space="preserve">do-se no levantamento de requisitos, modelagem de casos de uso e especificação de User Stories para um sistema Web direcionado a </w:t>
+        <w:t xml:space="preserve">O desenvolvimento deste projeto técnico permitiu aplicar de forma prática os pilares fundamentais da Engenharia de Software, concentrando-se no levantamento de requisitos, modelagem de casos de uso e especificação de User Stories para um sistema Web direcionado a </w:t>
       </w:r>
       <w:r>
         <w:rPr>
@@ -29287,19 +29068,7 @@
         <w:rPr>
           <w:rFonts w:ascii="Arial" w:eastAsia="Arial" w:hAnsi="Arial" w:cs="Arial"/>
         </w:rPr>
-        <w:t>A Engenharia de Requisitos desempenhou um papel crucial ao traduzir as necessidades da instituição em funcionalidades claras para os diversos atores mapeados (Administrador, Participante, Secretaria, Analista de Dados, Suporte Técnico e Auditor). A consist</w:t>
-      </w:r>
-      <w:r>
-        <w:rPr>
-          <w:rFonts w:ascii="Arial" w:eastAsia="Arial" w:hAnsi="Arial" w:cs="Arial"/>
-        </w:rPr>
-        <w:t xml:space="preserve">ência do projeto evidencia-se na estrita rastreabilidade entre as User Stories e os Fluxos (Principais e Alternativos), garantindo que as regras de negócio tivessem correspondência direta com o comportamento esperado do sistema, minimizando ambiguidades e </w:t>
-      </w:r>
-      <w:r>
-        <w:rPr>
-          <w:rFonts w:ascii="Arial" w:eastAsia="Arial" w:hAnsi="Arial" w:cs="Arial"/>
-        </w:rPr>
-        <w:t>preparando o terreno para a fase de codificação e testes.</w:t>
+        <w:t>A Engenharia de Requisitos desempenhou um papel crucial ao traduzir as necessidades da instituição em funcionalidades claras para os diversos atores mapeados (Administrador, Participante, Secretaria, Analista de Dados, Suporte Técnico e Auditor). A consistência do projeto evidencia-se na estrita rastreabilidade entre as User Stories e os Fluxos (Principais e Alternativos), garantindo que as regras de negócio tivessem correspondência direta com o comportamento esperado do sistema, minimizando ambiguidades e preparando o terreno para a fase de codificação e testes.</w:t>
       </w:r>
     </w:p>
     <w:p>
@@ -29343,13 +29112,7 @@
         <w:rPr>
           <w:rFonts w:ascii="Arial" w:eastAsia="Arial" w:hAnsi="Arial" w:cs="Arial"/>
         </w:rPr>
-        <w:t xml:space="preserve"> não são meros adendos, mas o núcleo que viabiliza o projeto. O uso de criptografia ha</w:t>
-      </w:r>
-      <w:r>
-        <w:rPr>
-          <w:rFonts w:ascii="Arial" w:eastAsia="Arial" w:hAnsi="Arial" w:cs="Arial"/>
-        </w:rPr>
-        <w:t>sh (SHA-256) para as credenciais de acesso e a total dissociação entre logs de auditoria e as respostas dos questionários garantem o cumprimento estrito da Lei Geral de Proteção de Dados (LGPD) e o anonimato absoluto dos participantes.</w:t>
+        <w:t xml:space="preserve"> não são meros adendos, mas o núcleo que viabiliza o projeto. O uso de criptografia hash (SHA-256) para as credenciais de acesso e a total dissociação entre logs de auditoria e as respostas dos questionários garantem o cumprimento estrito da Lei Geral de Proteção de Dados (LGPD) e o anonimato absoluto dos participantes.</w:t>
       </w:r>
     </w:p>
     <w:p>
@@ -29365,13 +29128,7 @@
         <w:rPr>
           <w:rFonts w:ascii="Arial" w:eastAsia="Arial" w:hAnsi="Arial" w:cs="Arial"/>
         </w:rPr>
-        <w:t>Desse modo, o artefa</w:t>
-      </w:r>
-      <w:r>
-        <w:rPr>
-          <w:rFonts w:ascii="Arial" w:eastAsia="Arial" w:hAnsi="Arial" w:cs="Arial"/>
-        </w:rPr>
-        <w:t>to gerado consolida uma visão sistêmica, madura e tecnicamente viável, mitigando riscos de segurança e operacionais, e fornecendo à instituição uma ferramenta confiável para a coleta de dados e tomada de decisões estratégicas.</w:t>
+        <w:t>Desse modo, o artefato gerado consolida uma visão sistêmica, madura e tecnicamente viável, mitigando riscos de segurança e operacionais, e fornecendo à instituição uma ferramenta confiável para a coleta de dados e tomada de decisões estratégicas.</w:t>
       </w:r>
     </w:p>
     <w:p>
@@ -29482,6 +29239,19 @@
 </file>
 
 <file path=word/footer1.xml><?xml version="1.0" encoding="utf-8"?>
+<w:ftr xmlns:wpc="http://schemas.microsoft.com/office/word/2010/wordprocessingCanvas" xmlns:cx="http://schemas.microsoft.com/office/drawing/2014/chartex" xmlns:cx1="http://schemas.microsoft.com/office/drawing/2015/9/8/chartex" xmlns:cx2="http://schemas.microsoft.com/office/drawing/2015/10/21/chartex" xmlns:cx3="http://schemas.microsoft.com/office/drawing/2016/5/9/chartex" xmlns:cx4="http://schemas.microsoft.com/office/drawing/2016/5/10/chartex" xmlns:cx5="http://schemas.microsoft.com/office/drawing/2016/5/11/chartex" xmlns:cx6="http://schemas.microsoft.com/office/drawing/2016/5/12/chartex" xmlns:cx7="http://schemas.microsoft.com/office/drawing/2016/5/13/chartex" xmlns:cx8="http://schemas.microsoft.com/office/drawing/2016/5/14/chartex" xmlns:mc="http://schemas.openxmlformats.org/markup-compatibility/2006" xmlns:aink="http://schemas.microsoft.com/office/drawing/2016/ink" xmlns:am3d="http://schemas.microsoft.com/office/drawing/2017/model3d" xmlns:o="urn:schemas-microsoft-com:office:office" xmlns:r="http://schemas.openxmlformats.org/officeDocument/2006/relationships" xmlns:m="http://schemas.openxmlformats.org/officeDocument/2006/math" xmlns:v="urn:schemas-microsoft-com:vml" xmlns:wp14="http://schemas.microsoft.com/office/word/2010/wordprocessingDrawing" xmlns:wp="http://schemas.openxmlformats.org/drawingml/2006/wordprocessingDrawing" xmlns:w10="urn:schemas-microsoft-com:office:word" xmlns:w="http://schemas.openxmlformats.org/wordprocessingml/2006/main" xmlns:w14="http://schemas.microsoft.com/office/word/2010/wordml" xmlns:w15="http://schemas.microsoft.com/office/word/2012/wordml" xmlns:w16cid="http://schemas.microsoft.com/office/word/2016/wordml/cid" xmlns:w16se="http://schemas.microsoft.com/office/word/2015/wordml/symex" xmlns:wpg="http://schemas.microsoft.com/office/word/2010/wordprocessingGroup" xmlns:wpi="http://schemas.microsoft.com/office/word/2010/wordprocessingInk" xmlns:wne="http://schemas.microsoft.com/office/word/2006/wordml" xmlns:wps="http://schemas.microsoft.com/office/word/2010/wordprocessingShape" mc:Ignorable="w14 w15 w16se w16cid wp14">
+  <w:p>
+    <w:pPr>
+      <w:pStyle w:val="Rodap"/>
+      <w:rPr>
+        <w:rFonts w:hint="eastAsia"/>
+      </w:rPr>
+    </w:pPr>
+  </w:p>
+</w:ftr>
+</file>
+
+<file path=word/footer2.xml><?xml version="1.0" encoding="utf-8"?>
 <w:ftr xmlns:wpc="http://schemas.microsoft.com/office/word/2010/wordprocessingCanvas" xmlns:cx="http://schemas.microsoft.com/office/drawing/2014/chartex" xmlns:cx1="http://schemas.microsoft.com/office/drawing/2015/9/8/chartex" xmlns:cx2="http://schemas.microsoft.com/office/drawing/2015/10/21/chartex" xmlns:cx3="http://schemas.microsoft.com/office/drawing/2016/5/9/chartex" xmlns:cx4="http://schemas.microsoft.com/office/drawing/2016/5/10/chartex" xmlns:cx5="http://schemas.microsoft.com/office/drawing/2016/5/11/chartex" xmlns:cx6="http://schemas.microsoft.com/office/drawing/2016/5/12/chartex" xmlns:cx7="http://schemas.microsoft.com/office/drawing/2016/5/13/chartex" xmlns:cx8="http://schemas.microsoft.com/office/drawing/2016/5/14/chartex" xmlns:mc="http://schemas.openxmlformats.org/markup-compatibility/2006" xmlns:aink="http://schemas.microsoft.com/office/drawing/2016/ink" xmlns:am3d="http://schemas.microsoft.com/office/drawing/2017/model3d" xmlns:o="urn:schemas-microsoft-com:office:office" xmlns:r="http://schemas.openxmlformats.org/officeDocument/2006/relationships" xmlns:m="http://schemas.openxmlformats.org/officeDocument/2006/math" xmlns:v="urn:schemas-microsoft-com:vml" xmlns:wp14="http://schemas.microsoft.com/office/word/2010/wordprocessingDrawing" xmlns:wp="http://schemas.openxmlformats.org/drawingml/2006/wordprocessingDrawing" xmlns:w10="urn:schemas-microsoft-com:office:word" xmlns:w="http://schemas.openxmlformats.org/wordprocessingml/2006/main" xmlns:w14="http://schemas.microsoft.com/office/word/2010/wordml" xmlns:w15="http://schemas.microsoft.com/office/word/2012/wordml" xmlns:w16cid="http://schemas.microsoft.com/office/word/2016/wordml/cid" xmlns:w16se="http://schemas.microsoft.com/office/word/2015/wordml/symex" xmlns:wpg="http://schemas.microsoft.com/office/word/2010/wordprocessingGroup" xmlns:wpi="http://schemas.microsoft.com/office/word/2010/wordprocessingInk" xmlns:wne="http://schemas.microsoft.com/office/word/2006/wordml" xmlns:wps="http://schemas.microsoft.com/office/word/2010/wordprocessingShape" mc:Ignorable="w14 w15 w16se w16cid wp14">
   <w:p>
     <w:pPr>
@@ -29521,12 +29291,6 @@
     </w:p>
   </w:footnote>
 </w:footnotes>
-</file>
-
-<file path=word/header1.xml><?xml version="1.0" encoding="utf-8"?>
-<w:hdr xmlns:wpc="http://schemas.microsoft.com/office/word/2010/wordprocessingCanvas" xmlns:cx="http://schemas.microsoft.com/office/drawing/2014/chartex" xmlns:cx1="http://schemas.microsoft.com/office/drawing/2015/9/8/chartex" xmlns:cx2="http://schemas.microsoft.com/office/drawing/2015/10/21/chartex" xmlns:cx3="http://schemas.microsoft.com/office/drawing/2016/5/9/chartex" xmlns:cx4="http://schemas.microsoft.com/office/drawing/2016/5/10/chartex" xmlns:cx5="http://schemas.microsoft.com/office/drawing/2016/5/11/chartex" xmlns:cx6="http://schemas.microsoft.com/office/drawing/2016/5/12/chartex" xmlns:cx7="http://schemas.microsoft.com/office/drawing/2016/5/13/chartex" xmlns:cx8="http://schemas.microsoft.com/office/drawing/2016/5/14/chartex" xmlns:mc="http://schemas.openxmlformats.org/markup-compatibility/2006" xmlns:aink="http://schemas.microsoft.com/office/drawing/2016/ink" xmlns:am3d="http://schemas.microsoft.com/office/drawing/2017/model3d" xmlns:o="urn:schemas-microsoft-com:office:office" xmlns:r="http://schemas.openxmlformats.org/officeDocument/2006/relationships" xmlns:m="http://schemas.openxmlformats.org/officeDocument/2006/math" xmlns:v="urn:schemas-microsoft-com:vml" xmlns:wp14="http://schemas.microsoft.com/office/word/2010/wordprocessingDrawing" xmlns:wp="http://schemas.openxmlformats.org/drawingml/2006/wordprocessingDrawing" xmlns:w10="urn:schemas-microsoft-com:office:word" xmlns:w="http://schemas.openxmlformats.org/wordprocessingml/2006/main" xmlns:w14="http://schemas.microsoft.com/office/word/2010/wordml" xmlns:w15="http://schemas.microsoft.com/office/word/2012/wordml" xmlns:w16cid="http://schemas.microsoft.com/office/word/2016/wordml/cid" xmlns:w16se="http://schemas.microsoft.com/office/word/2015/wordml/symex" xmlns:wpg="http://schemas.microsoft.com/office/word/2010/wordprocessingGroup" xmlns:wpi="http://schemas.microsoft.com/office/word/2010/wordprocessingInk" xmlns:wne="http://schemas.microsoft.com/office/word/2006/wordml" xmlns:wps="http://schemas.microsoft.com/office/word/2010/wordprocessingShape" mc:Ignorable="w14 w15 w16se w16cid wp14">
-  <w:p/>
-</w:hdr>
 </file>
 
 <file path=word/numbering.xml><?xml version="1.0" encoding="utf-8"?>
@@ -35131,7 +34895,7 @@
     <w:lsdException w:name="footnote text" w:semiHidden="1" w:unhideWhenUsed="1"/>
     <w:lsdException w:name="annotation text" w:semiHidden="1" w:unhideWhenUsed="1"/>
     <w:lsdException w:name="header" w:semiHidden="1" w:unhideWhenUsed="1"/>
-    <w:lsdException w:name="footer" w:semiHidden="1" w:unhideWhenUsed="1"/>
+    <w:lsdException w:name="footer" w:semiHidden="1" w:uiPriority="0" w:unhideWhenUsed="1"/>
     <w:lsdException w:name="index heading" w:semiHidden="1" w:unhideWhenUsed="1"/>
     <w:lsdException w:name="caption" w:semiHidden="1" w:uiPriority="35" w:unhideWhenUsed="1" w:qFormat="1"/>
     <w:lsdException w:name="table of figures" w:semiHidden="1" w:unhideWhenUsed="1"/>
@@ -35780,6 +35544,60 @@
       </w:tblCellMar>
     </w:tblPr>
   </w:style>
+  <w:style w:type="paragraph" w:customStyle="1" w:styleId="Standard">
+    <w:name w:val="Standard"/>
+    <w:rsid w:val="004F03CC"/>
+    <w:pPr>
+      <w:suppressAutoHyphens/>
+      <w:autoSpaceDN w:val="0"/>
+      <w:textAlignment w:val="baseline"/>
+    </w:pPr>
+    <w:rPr>
+      <w:rFonts w:eastAsia="Noto Serif CJK SC" w:cs="Noto Sans Devanagari"/>
+      <w:kern w:val="3"/>
+      <w:lang w:val="pt-BR" w:eastAsia="zh-CN" w:bidi="hi-IN"/>
+    </w:rPr>
+  </w:style>
+  <w:style w:type="paragraph" w:customStyle="1" w:styleId="Textbody">
+    <w:name w:val="Text body"/>
+    <w:basedOn w:val="Standard"/>
+    <w:rsid w:val="004F03CC"/>
+    <w:pPr>
+      <w:spacing w:after="140" w:line="276" w:lineRule="auto"/>
+    </w:pPr>
+  </w:style>
+  <w:style w:type="paragraph" w:styleId="Rodap">
+    <w:name w:val="footer"/>
+    <w:basedOn w:val="Normal"/>
+    <w:link w:val="RodapChar"/>
+    <w:rsid w:val="004F03CC"/>
+    <w:pPr>
+      <w:suppressLineNumbers/>
+      <w:tabs>
+        <w:tab w:val="center" w:pos="4819"/>
+        <w:tab w:val="right" w:pos="9638"/>
+      </w:tabs>
+      <w:suppressAutoHyphens/>
+      <w:autoSpaceDN w:val="0"/>
+      <w:textAlignment w:val="baseline"/>
+    </w:pPr>
+    <w:rPr>
+      <w:rFonts w:eastAsia="Noto Serif CJK SC" w:cs="Noto Sans Devanagari"/>
+      <w:kern w:val="3"/>
+      <w:lang w:val="pt-BR" w:eastAsia="zh-CN" w:bidi="hi-IN"/>
+    </w:rPr>
+  </w:style>
+  <w:style w:type="character" w:customStyle="1" w:styleId="RodapChar">
+    <w:name w:val="Rodapé Char"/>
+    <w:basedOn w:val="Fontepargpadro"/>
+    <w:link w:val="Rodap"/>
+    <w:rsid w:val="004F03CC"/>
+    <w:rPr>
+      <w:rFonts w:eastAsia="Noto Serif CJK SC" w:cs="Noto Sans Devanagari"/>
+      <w:kern w:val="3"/>
+      <w:lang w:val="pt-BR" w:eastAsia="zh-CN" w:bidi="hi-IN"/>
+    </w:rPr>
+  </w:style>
 </w:styles>
 </file>
 

</xml_diff>